<commit_message>
Expand selected-hand typing courses and manuals to 50 lessons
</commit_message>
<xml_diff>
--- a/downloads/Left_Hand_Only_Typing_Manual.docx
+++ b/downloads/Left_Hand_Only_Typing_Manual.docx
@@ -25,7 +25,7 @@
     </w:p>
     <w:p>
       <w:r>
-        <w:t>20 progressive lessons with words, sentences, numbers, shortcuts, and timed practice</w:t>
+        <w:t>50 progressive lessons with words, sentences, numbers, shortcuts, and timed practice</w:t>
       </w:r>
     </w:p>
     <w:p>
@@ -38,12 +38,17 @@
     </w:p>
     <w:p>
       <w:r>
-        <w:t>Use only your left hand to type across the whole keyboard. This manual teaches a movable hand approach, with F G H J as a central resting position. You will learn to find keys, enter text, correct mistakes, and save your work.</w:t>
+        <w:t>This course is for learners who have function in only their left hand. Use only your left hand to type across the whole keyboard. This manual teaches a movable hand approach, with F G H J as a central resting position. You will learn to find keys, enter text, correct mistakes, and save your work.</w:t>
       </w:r>
     </w:p>
     <w:p>
       <w:r>
         <w:t>The lessons assume a physical US English QWERTY keyboard and Windows 11. The letter practice works in other text editors, but settings and shortcuts may differ. No special keyboard or paid course is required.</w:t>
+      </w:r>
+    </w:p>
+    <w:p>
+      <w:r>
+        <w:t>Select Left hand only or Right hand only in Keyboarding Center Settings to load the matching 50 lessons. Lessons 1 to 20 build foundations; Lessons 21 to 50 develop fluency, symbols, and practical writing.</w:t>
       </w:r>
     </w:p>
     <w:p>
@@ -335,6 +340,306 @@
       <w:hyperlink w:anchor="lesson20">
         <w:r>
           <w:t>Lesson 20  Writing an independent message</w:t>
+        </w:r>
+      </w:hyperlink>
+    </w:p>
+    <w:p>
+      <w:pPr>
+        <w:pStyle w:val="ContentsEntry"/>
+      </w:pPr>
+      <w:hyperlink w:anchor="lesson21">
+        <w:r>
+          <w:t>Lesson 21  Returning to the central landmarks</w:t>
+        </w:r>
+      </w:hyperlink>
+    </w:p>
+    <w:p>
+      <w:pPr>
+        <w:pStyle w:val="ContentsEntry"/>
+      </w:pPr>
+      <w:hyperlink w:anchor="lesson22">
+        <w:r>
+          <w:t>Lesson 22  Travelling to the left edge</w:t>
+        </w:r>
+      </w:hyperlink>
+    </w:p>
+    <w:p>
+      <w:pPr>
+        <w:pStyle w:val="ContentsEntry"/>
+      </w:pPr>
+      <w:hyperlink w:anchor="lesson23">
+        <w:r>
+          <w:t>Lesson 23  Travelling to the right edge</w:t>
+        </w:r>
+      </w:hyperlink>
+    </w:p>
+    <w:p>
+      <w:pPr>
+        <w:pStyle w:val="ContentsEntry"/>
+      </w:pPr>
+      <w:hyperlink w:anchor="lesson24">
+        <w:r>
+          <w:t>Lesson 24  Top row travel</w:t>
+        </w:r>
+      </w:hyperlink>
+    </w:p>
+    <w:p>
+      <w:pPr>
+        <w:pStyle w:val="ContentsEntry"/>
+      </w:pPr>
+      <w:hyperlink w:anchor="lesson25">
+        <w:r>
+          <w:t>Lesson 25  Bottom row control</w:t>
+        </w:r>
+      </w:hyperlink>
+    </w:p>
+    <w:p>
+      <w:pPr>
+        <w:pStyle w:val="ContentsEntry"/>
+      </w:pPr>
+      <w:hyperlink w:anchor="lesson26">
+        <w:r>
+          <w:t>Lesson 26  Moving between rows</w:t>
+        </w:r>
+      </w:hyperlink>
+    </w:p>
+    <w:p>
+      <w:pPr>
+        <w:pStyle w:val="ContentsEntry"/>
+      </w:pPr>
+      <w:hyperlink w:anchor="lesson27">
+        <w:r>
+          <w:t>Lesson 27  Repeated letters</w:t>
+        </w:r>
+      </w:hyperlink>
+    </w:p>
+    <w:p>
+      <w:pPr>
+        <w:pStyle w:val="ContentsEntry"/>
+      </w:pPr>
+      <w:hyperlink w:anchor="lesson28">
+        <w:r>
+          <w:t>Lesson 28  Longer words in small parts</w:t>
+        </w:r>
+      </w:hyperlink>
+    </w:p>
+    <w:p>
+      <w:pPr>
+        <w:pStyle w:val="ContentsEntry"/>
+      </w:pPr>
+      <w:hyperlink w:anchor="lesson29">
+        <w:r>
+          <w:t>Lesson 29  Sentence rhythm</w:t>
+        </w:r>
+      </w:hyperlink>
+    </w:p>
+    <w:p>
+      <w:pPr>
+        <w:pStyle w:val="ContentsEntry"/>
+      </w:pPr>
+      <w:hyperlink w:anchor="lesson30">
+        <w:r>
+          <w:t>Lesson 30  Connected sentences</w:t>
+        </w:r>
+      </w:hyperlink>
+    </w:p>
+    <w:p>
+      <w:pPr>
+        <w:pStyle w:val="ContentsEntry"/>
+      </w:pPr>
+      <w:hyperlink w:anchor="lesson31">
+        <w:r>
+          <w:t>Lesson 31  Amounts and decimal points</w:t>
+        </w:r>
+      </w:hyperlink>
+    </w:p>
+    <w:p>
+      <w:pPr>
+        <w:pStyle w:val="ContentsEntry"/>
+      </w:pPr>
+      <w:hyperlink w:anchor="lesson32">
+        <w:r>
+          <w:t>Lesson 32  Dates and appointment times</w:t>
+        </w:r>
+      </w:hyperlink>
+    </w:p>
+    <w:p>
+      <w:pPr>
+        <w:pStyle w:val="ContentsEntry"/>
+      </w:pPr>
+      <w:hyperlink w:anchor="lesson33">
+        <w:r>
+          <w:t>Lesson 33  Names and practice addresses</w:t>
+        </w:r>
+      </w:hyperlink>
+    </w:p>
+    <w:p>
+      <w:pPr>
+        <w:pStyle w:val="ContentsEntry"/>
+      </w:pPr>
+      <w:hyperlink w:anchor="lesson34">
+        <w:r>
+          <w:t>Lesson 34  Questions and short replies</w:t>
+        </w:r>
+      </w:hyperlink>
+    </w:p>
+    <w:p>
+      <w:pPr>
+        <w:pStyle w:val="ContentsEntry"/>
+      </w:pPr>
+      <w:hyperlink w:anchor="lesson35">
+        <w:r>
+          <w:t>Lesson 35  Apostrophes in messages</w:t>
+        </w:r>
+      </w:hyperlink>
+    </w:p>
+    <w:p>
+      <w:pPr>
+        <w:pStyle w:val="ContentsEntry"/>
+      </w:pPr>
+      <w:hyperlink w:anchor="lesson36">
+        <w:r>
+          <w:t>Lesson 36  Quotation marks and dialogue</w:t>
+        </w:r>
+      </w:hyperlink>
+    </w:p>
+    <w:p>
+      <w:pPr>
+        <w:pStyle w:val="ContentsEntry"/>
+      </w:pPr>
+      <w:hyperlink w:anchor="lesson37">
+        <w:r>
+          <w:t>Lesson 37  Percentages in everyday text</w:t>
+        </w:r>
+      </w:hyperlink>
+    </w:p>
+    <w:p>
+      <w:pPr>
+        <w:pStyle w:val="ContentsEntry"/>
+      </w:pPr>
+      <w:hyperlink w:anchor="lesson38">
+        <w:r>
+          <w:t>Lesson 38  Number signs and labels</w:t>
+        </w:r>
+      </w:hyperlink>
+    </w:p>
+    <w:p>
+      <w:pPr>
+        <w:pStyle w:val="ContentsEntry"/>
+      </w:pPr>
+      <w:hyperlink w:anchor="lesson39">
+        <w:r>
+          <w:t>Lesson 39  Ampersands in names</w:t>
+        </w:r>
+      </w:hyperlink>
+    </w:p>
+    <w:p>
+      <w:pPr>
+        <w:pStyle w:val="ContentsEntry"/>
+      </w:pPr>
+      <w:hyperlink w:anchor="lesson40">
+        <w:r>
+          <w:t>Lesson 40  Hyphens and underscores</w:t>
+        </w:r>
+      </w:hyperlink>
+    </w:p>
+    <w:p>
+      <w:pPr>
+        <w:pStyle w:val="ContentsEntry"/>
+      </w:pPr>
+      <w:hyperlink w:anchor="lesson41">
+        <w:r>
+          <w:t>Lesson 41  Comparison signs</w:t>
+        </w:r>
+      </w:hyperlink>
+    </w:p>
+    <w:p>
+      <w:pPr>
+        <w:pStyle w:val="ContentsEntry"/>
+      </w:pPr>
+      <w:hyperlink w:anchor="lesson42">
+        <w:r>
+          <w:t>Lesson 42  Square brackets</w:t>
+        </w:r>
+      </w:hyperlink>
+    </w:p>
+    <w:p>
+      <w:pPr>
+        <w:pStyle w:val="ContentsEntry"/>
+      </w:pPr>
+      <w:hyperlink w:anchor="lesson43">
+        <w:r>
+          <w:t>Lesson 43  Braces backslash and vertical bar</w:t>
+        </w:r>
+      </w:hyperlink>
+    </w:p>
+    <w:p>
+      <w:pPr>
+        <w:pStyle w:val="ContentsEntry"/>
+      </w:pPr>
+      <w:hyperlink w:anchor="lesson44">
+        <w:r>
+          <w:t>Lesson 44  Asterisks and carets</w:t>
+        </w:r>
+      </w:hyperlink>
+    </w:p>
+    <w:p>
+      <w:pPr>
+        <w:pStyle w:val="ContentsEntry"/>
+      </w:pPr>
+      <w:hyperlink w:anchor="lesson45">
+        <w:r>
+          <w:t>Lesson 45  Grave accents and tildes</w:t>
+        </w:r>
+      </w:hyperlink>
+    </w:p>
+    <w:p>
+      <w:pPr>
+        <w:pStyle w:val="ContentsEntry"/>
+      </w:pPr>
+      <w:hyperlink w:anchor="lesson46">
+        <w:r>
+          <w:t>Lesson 46  Email addresses and web addresses</w:t>
+        </w:r>
+      </w:hyperlink>
+    </w:p>
+    <w:p>
+      <w:pPr>
+        <w:pStyle w:val="ContentsEntry"/>
+      </w:pPr>
+      <w:hyperlink w:anchor="lesson47">
+        <w:r>
+          <w:t>Lesson 47  Numbered instructions</w:t>
+        </w:r>
+      </w:hyperlink>
+    </w:p>
+    <w:p>
+      <w:pPr>
+        <w:pStyle w:val="ContentsEntry"/>
+      </w:pPr>
+      <w:hyperlink w:anchor="lesson48">
+        <w:r>
+          <w:t>Lesson 48  A practical work message</w:t>
+        </w:r>
+      </w:hyperlink>
+    </w:p>
+    <w:p>
+      <w:pPr>
+        <w:pStyle w:val="ContentsEntry"/>
+      </w:pPr>
+      <w:hyperlink w:anchor="lesson49">
+        <w:r>
+          <w:t>Lesson 49  Sustained paragraph practice</w:t>
+        </w:r>
+      </w:hyperlink>
+    </w:p>
+    <w:p>
+      <w:pPr>
+        <w:pStyle w:val="ContentsEntry"/>
+      </w:pPr>
+      <w:hyperlink w:anchor="lesson50">
+        <w:r>
+          <w:t>Lesson 50  Final one hand typing challenge</w:t>
         </w:r>
       </w:hyperlink>
     </w:p>
@@ -3519,19 +3824,19 @@
       </w:r>
     </w:p>
     <w:p>
-      <w:bookmarkStart w:id="104" w:name="timed"/>
+      <w:bookmarkStart w:id="21" w:name="lesson21"/>
       <w:pPr>
         <w:pStyle w:val="Heading1"/>
         <w:pageBreakBefore/>
       </w:pPr>
       <w:r>
-        <w:t>Timed practice</w:t>
-      </w:r>
-      <w:bookmarkEnd w:id="104"/>
-    </w:p>
-    <w:p>
-      <w:r>
-        <w:t>Use timed practice after Lesson 20, when the full passage is familiar. Timing is optional. Ask someone else to run the timer or use an accessible timer. Keep the same text, settings, and correction rule when comparing attempts.</w:t>
+        <w:t>Lesson 21 Returning to the central landmarks</w:t>
+      </w:r>
+      <w:bookmarkEnd w:id="21"/>
+    </w:p>
+    <w:p>
+      <w:r>
+        <w:t>Build a reliable return to F G H J between words.</w:t>
       </w:r>
     </w:p>
     <w:p>
@@ -3539,31 +3844,12 @@
         <w:pStyle w:val="Heading2"/>
       </w:pPr>
       <w:r>
-        <w:t>Choose a comfortable duration</w:t>
-      </w:r>
-    </w:p>
-    <w:p>
-      <w:pPr>
-        <w:pStyle w:val="ListBullet"/>
-      </w:pPr>
-      <w:r>
-        <w:t>1 minute: Establish a baseline. Stop when the timer ends, even in the middle of a sentence.</w:t>
-      </w:r>
-    </w:p>
-    <w:p>
-      <w:pPr>
-        <w:pStyle w:val="ListBullet"/>
-      </w:pPr>
-      <w:r>
-        <w:t>3 minutes: Try after shorter practice is comfortable. Include reading and correction time in the score.</w:t>
-      </w:r>
-    </w:p>
-    <w:p>
-      <w:pPr>
-        <w:pStyle w:val="ListBullet"/>
-      </w:pPr>
-      <w:r>
-        <w:t>6 minutes: Use only if the duration is comfortable. You may stop earlier. Record the actual time; never turn fatigue into a pass or fail test.</w:t>
+        <w:t>Find the keys</w:t>
+      </w:r>
+    </w:p>
+    <w:p>
+      <w:r>
+        <w:t>Find the raised marks on F and J. G and H lie between them. Space is below the letters.</w:t>
       </w:r>
     </w:p>
     <w:p>
@@ -3571,20 +3857,12 @@
         <w:pStyle w:val="Heading2"/>
       </w:pPr>
       <w:r>
-        <w:t>Passage to copy</w:t>
-      </w:r>
-    </w:p>
-    <w:p>
-      <w:pPr>
-        <w:pStyle w:val="Practice"/>
-      </w:pPr>
-      <w:r>
-        <w:t>Today I will write a short note. I can move my hand to each key and return to the centre when I need to. My goal is clear, useful writing. I will check the spaces, capitals, and punctuation before I save my work. Sam needs 4 pens and 2 pads for the meeting at 2:30. The pens cost $3.50. Can we bring the blue folder, too? I will read the note again and correct any mistakes. Each careful practice session helps me learn my own pattern.</w:t>
-      </w:r>
-    </w:p>
-    <w:p>
-      <w:r>
-        <w:t>If you finish early, type one space and begin the passage again. Count letters, digits, spaces, and punctuation in the final text. Do not count Enter or correction keys as characters.</w:t>
+        <w:t>Use your left hand</w:t>
+      </w:r>
+    </w:p>
+    <w:p>
+      <w:r>
+        <w:t>Reset your left little, ring, middle, and index fingers across F G H J. Use a stronger finger after moving the hand if that is easier.</w:t>
       </w:r>
     </w:p>
     <w:p>
@@ -3592,31 +3870,7 @@
         <w:pStyle w:val="Heading2"/>
       </w:pPr>
       <w:r>
-        <w:t>Calculate speed</w:t>
-      </w:r>
-    </w:p>
-    <w:p>
-      <w:r>
-        <w:t>Gross words per minute equals final typed characters divided by 5, then divided by minutes. For example, 150 characters in 3 minutes gives 10 gross words per minute. Report accuracy separately; different typing programs may use different scoring rules.</w:t>
-      </w:r>
-    </w:p>
-    <w:p>
-      <w:bookmarkStart w:id="105" w:name="assessment"/>
-      <w:pPr>
-        <w:pStyle w:val="Heading1"/>
-        <w:pageBreakBefore/>
-      </w:pPr>
-      <w:r>
-        <w:t>Skills check and answers</w:t>
-      </w:r>
-      <w:bookmarkEnd w:id="105"/>
-    </w:p>
-    <w:p>
-      <w:pPr>
-        <w:pStyle w:val="Heading2"/>
-      </w:pPr>
-      <w:r>
-        <w:t>Practical check</w:t>
+        <w:t>Step by step</w:t>
       </w:r>
     </w:p>
     <w:p>
@@ -3627,7 +3881,7 @@
         </w:numPr>
       </w:pPr>
       <w:r>
-        <w:t>Find F, J, Space, Enter, and Backspace without trial and error in an important document.</w:t>
+        <w:t>Read a whole group before typing. After each group, lift the hand briefly and find a landmark again. Avoid pressing while searching.</w:t>
       </w:r>
     </w:p>
     <w:p>
@@ -3638,14 +3892,3719 @@
         </w:numPr>
       </w:pPr>
       <w:r>
-        <w:t>Type the message from Lesson 20. Add one sentence of your own.</w:t>
+        <w:t>In a practice document, copy each practice line. Use Enter after each line. Review the result before repeating.</w:t>
+      </w:r>
+    </w:p>
+    <w:p>
+      <w:pPr>
+        <w:pStyle w:val="Heading2"/>
+      </w:pPr>
+      <w:r>
+        <w:t>Practice</w:t>
+      </w:r>
+    </w:p>
+    <w:p>
+      <w:pPr>
+        <w:pStyle w:val="Practice"/>
+      </w:pPr>
+      <w:r>
+        <w:t>fig jig high</w:t>
+      </w:r>
+    </w:p>
+    <w:p>
+      <w:pPr>
+        <w:pStyle w:val="Practice"/>
+      </w:pPr>
+      <w:r>
+        <w:t>My hand can find F and J.</w:t>
+      </w:r>
+    </w:p>
+    <w:p>
+      <w:pPr>
+        <w:pStyle w:val="Practice"/>
+      </w:pPr>
+      <w:r>
+        <w:t>I pause, return, and begin again.</w:t>
+      </w:r>
+    </w:p>
+    <w:p>
+      <w:pPr>
+        <w:pStyle w:val="Heading2"/>
+      </w:pPr>
+      <w:r>
+        <w:t>Check your work</w:t>
+      </w:r>
+    </w:p>
+    <w:p>
+      <w:r>
+        <w:t>Can you return to a raised mark after each group without random key presses?</w:t>
+      </w:r>
+    </w:p>
+    <w:p>
+      <w:bookmarkStart w:id="22" w:name="lesson22"/>
+      <w:pPr>
+        <w:pStyle w:val="Heading1"/>
+        <w:pageBreakBefore/>
+      </w:pPr>
+      <w:r>
+        <w:t>Lesson 22 Travelling to the left edge</w:t>
+      </w:r>
+      <w:bookmarkEnd w:id="22"/>
+    </w:p>
+    <w:p>
+      <w:r>
+        <w:t>Type left-edge letters and return with controlled hand movement.</w:t>
+      </w:r>
+    </w:p>
+    <w:p>
+      <w:pPr>
+        <w:pStyle w:val="Heading2"/>
+      </w:pPr>
+      <w:r>
+        <w:t>Find the keys</w:t>
+      </w:r>
+    </w:p>
+    <w:p>
+      <w:r>
+        <w:t>Q A Z are the outer letter keys on the left. W S X are one letter column inward; E D C are next.</w:t>
+      </w:r>
+    </w:p>
+    <w:p>
+      <w:pPr>
+        <w:pStyle w:val="Heading2"/>
+      </w:pPr>
+      <w:r>
+        <w:t>Use your left hand</w:t>
+      </w:r>
+    </w:p>
+    <w:p>
+      <w:r>
+        <w:t>Move your left hand and forearm together toward Q A Z. Use your index or middle finger instead of forcing a little-finger stretch.</w:t>
+      </w:r>
+    </w:p>
+    <w:p>
+      <w:pPr>
+        <w:pStyle w:val="Heading2"/>
+      </w:pPr>
+      <w:r>
+        <w:t>Step by step</w:t>
       </w:r>
     </w:p>
     <w:p>
       <w:pPr>
         <w:numPr>
           <w:ilvl w:val="0"/>
-          <w:numId w:val="32"/>
+          <w:numId w:val="33"/>
+        </w:numPr>
+      </w:pPr>
+      <w:r>
+        <w:t>Locate each outer key before the first group. Type at a pace that lets you move rather than twist. Refind F between groups.</w:t>
+      </w:r>
+    </w:p>
+    <w:p>
+      <w:pPr>
+        <w:numPr>
+          <w:ilvl w:val="0"/>
+          <w:numId w:val="33"/>
+        </w:numPr>
+      </w:pPr>
+      <w:r>
+        <w:t>In a practice document, copy each practice line. Use Enter after each line. Review the result before repeating.</w:t>
+      </w:r>
+    </w:p>
+    <w:p>
+      <w:pPr>
+        <w:pStyle w:val="Heading2"/>
+      </w:pPr>
+      <w:r>
+        <w:t>Practice</w:t>
+      </w:r>
+    </w:p>
+    <w:p>
+      <w:pPr>
+        <w:pStyle w:val="Practice"/>
+      </w:pPr>
+      <w:r>
+        <w:t>we saw a wax seal</w:t>
+      </w:r>
+    </w:p>
+    <w:p>
+      <w:pPr>
+        <w:pStyle w:val="Practice"/>
+      </w:pPr>
+      <w:r>
+        <w:t>A quiet cat waits by the desk.</w:t>
+      </w:r>
+    </w:p>
+    <w:p>
+      <w:pPr>
+        <w:pStyle w:val="Practice"/>
+      </w:pPr>
+      <w:r>
+        <w:t>Zoe can read six clear words.</w:t>
+      </w:r>
+    </w:p>
+    <w:p>
+      <w:pPr>
+        <w:pStyle w:val="Heading2"/>
+      </w:pPr>
+      <w:r>
+        <w:t>Check your work</w:t>
+      </w:r>
+    </w:p>
+    <w:p>
+      <w:r>
+        <w:t>Check Q versus W, A versus S, and Z versus X. Repeat the pair that needs work.</w:t>
+      </w:r>
+    </w:p>
+    <w:p>
+      <w:bookmarkStart w:id="23" w:name="lesson23"/>
+      <w:pPr>
+        <w:pStyle w:val="Heading1"/>
+        <w:pageBreakBefore/>
+      </w:pPr>
+      <w:r>
+        <w:t>Lesson 23 Travelling to the right edge</w:t>
+      </w:r>
+      <w:bookmarkEnd w:id="23"/>
+    </w:p>
+    <w:p>
+      <w:r>
+        <w:t>Use the selected hand for right-edge letters and punctuation.</w:t>
+      </w:r>
+    </w:p>
+    <w:p>
+      <w:pPr>
+        <w:pStyle w:val="Heading2"/>
+      </w:pPr>
+      <w:r>
+        <w:t>Find the keys</w:t>
+      </w:r>
+    </w:p>
+    <w:p>
+      <w:r>
+        <w:t>P is right of O on the top row. K and L are right of J. Period is two keys right of M.</w:t>
+      </w:r>
+    </w:p>
+    <w:p>
+      <w:pPr>
+        <w:pStyle w:val="Heading2"/>
+      </w:pPr>
+      <w:r>
+        <w:t>Use your left hand</w:t>
+      </w:r>
+    </w:p>
+    <w:p>
+      <w:r>
+        <w:t>Move your left hand right past J to K L and P. Use the index or middle finger and let the forearm follow.</w:t>
+      </w:r>
+    </w:p>
+    <w:p>
+      <w:pPr>
+        <w:pStyle w:val="Heading2"/>
+      </w:pPr>
+      <w:r>
+        <w:t>Step by step</w:t>
+      </w:r>
+    </w:p>
+    <w:p>
+      <w:pPr>
+        <w:numPr>
+          <w:ilvl w:val="0"/>
+          <w:numId w:val="34"/>
+        </w:numPr>
+      </w:pPr>
+      <w:r>
+        <w:t>Read through the punctuation before typing. Return by the J landmark whenever you lose position. Use the same hand for the final period.</w:t>
+      </w:r>
+    </w:p>
+    <w:p>
+      <w:pPr>
+        <w:numPr>
+          <w:ilvl w:val="0"/>
+          <w:numId w:val="34"/>
+        </w:numPr>
+      </w:pPr>
+      <w:r>
+        <w:t>In a practice document, copy each practice line. Use Enter after each line. Review the result before repeating.</w:t>
+      </w:r>
+    </w:p>
+    <w:p>
+      <w:pPr>
+        <w:pStyle w:val="Heading2"/>
+      </w:pPr>
+      <w:r>
+        <w:t>Practice</w:t>
+      </w:r>
+    </w:p>
+    <w:p>
+      <w:pPr>
+        <w:pStyle w:val="Practice"/>
+      </w:pPr>
+      <w:r>
+        <w:t>look pool pupil</w:t>
+      </w:r>
+    </w:p>
+    <w:p>
+      <w:pPr>
+        <w:pStyle w:val="Practice"/>
+      </w:pPr>
+      <w:r>
+        <w:t>Jill put a purple cup on the shelf.</w:t>
+      </w:r>
+    </w:p>
+    <w:p>
+      <w:pPr>
+        <w:pStyle w:val="Practice"/>
+      </w:pPr>
+      <w:r>
+        <w:t>I can reach P, L, and period.</w:t>
+      </w:r>
+    </w:p>
+    <w:p>
+      <w:pPr>
+        <w:pStyle w:val="Heading2"/>
+      </w:pPr>
+      <w:r>
+        <w:t>Check your work</w:t>
+      </w:r>
+    </w:p>
+    <w:p>
+      <w:r>
+        <w:t>Check that periods and spaces are intentional, with no accidental semicolons.</w:t>
+      </w:r>
+    </w:p>
+    <w:p>
+      <w:bookmarkStart w:id="24" w:name="lesson24"/>
+      <w:pPr>
+        <w:pStyle w:val="Heading1"/>
+        <w:pageBreakBefore/>
+      </w:pPr>
+      <w:r>
+        <w:t>Lesson 24 Top row travel</w:t>
+      </w:r>
+      <w:bookmarkEnd w:id="24"/>
+    </w:p>
+    <w:p>
+      <w:r>
+        <w:t>Connect top-row letters into longer words.</w:t>
+      </w:r>
+    </w:p>
+    <w:p>
+      <w:pPr>
+        <w:pStyle w:val="Heading2"/>
+      </w:pPr>
+      <w:r>
+        <w:t>Find the keys</w:t>
+      </w:r>
+    </w:p>
+    <w:p>
+      <w:r>
+        <w:t>The top letter row runs Q W E R T Y U I O P. It sits below the number row.</w:t>
+      </w:r>
+    </w:p>
+    <w:p>
+      <w:pPr>
+        <w:pStyle w:val="Heading2"/>
+      </w:pPr>
+      <w:r>
+        <w:t>Use your left hand</w:t>
+      </w:r>
+    </w:p>
+    <w:p>
+      <w:r>
+        <w:t>Try the left little finger near R, ring near T, middle near Y, and index near U. Move the hand for the outer letters.</w:t>
+      </w:r>
+    </w:p>
+    <w:p>
+      <w:pPr>
+        <w:pStyle w:val="Heading2"/>
+      </w:pPr>
+      <w:r>
+        <w:t>Step by step</w:t>
+      </w:r>
+    </w:p>
+    <w:p>
+      <w:pPr>
+        <w:numPr>
+          <w:ilvl w:val="0"/>
+          <w:numId w:val="35"/>
+        </w:numPr>
+      </w:pPr>
+      <w:r>
+        <w:t>Let each word guide a series of small moves along the row. Return to F or J between words when useful. Do not keep the other fingers planted.</w:t>
+      </w:r>
+    </w:p>
+    <w:p>
+      <w:pPr>
+        <w:numPr>
+          <w:ilvl w:val="0"/>
+          <w:numId w:val="35"/>
+        </w:numPr>
+      </w:pPr>
+      <w:r>
+        <w:t>In a practice document, copy each practice line. Use Enter after each line. Review the result before repeating.</w:t>
+      </w:r>
+    </w:p>
+    <w:p>
+      <w:pPr>
+        <w:pStyle w:val="Heading2"/>
+      </w:pPr>
+      <w:r>
+        <w:t>Practice</w:t>
+      </w:r>
+    </w:p>
+    <w:p>
+      <w:pPr>
+        <w:pStyle w:val="Practice"/>
+      </w:pPr>
+      <w:r>
+        <w:t>type writer quiet poetry</w:t>
+      </w:r>
+    </w:p>
+    <w:p>
+      <w:pPr>
+        <w:pStyle w:val="Practice"/>
+      </w:pPr>
+      <w:r>
+        <w:t>We write a reply to your query.</w:t>
+      </w:r>
+    </w:p>
+    <w:p>
+      <w:pPr>
+        <w:pStyle w:val="Practice"/>
+      </w:pPr>
+      <w:r>
+        <w:t>The quiet writer will type a report.</w:t>
+      </w:r>
+    </w:p>
+    <w:p>
+      <w:pPr>
+        <w:pStyle w:val="Heading2"/>
+      </w:pPr>
+      <w:r>
+        <w:t>Check your work</w:t>
+      </w:r>
+    </w:p>
+    <w:p>
+      <w:r>
+        <w:t>Did every key press stay on the letter row rather than the number row?</w:t>
+      </w:r>
+    </w:p>
+    <w:p>
+      <w:bookmarkStart w:id="25" w:name="lesson25"/>
+      <w:pPr>
+        <w:pStyle w:val="Heading1"/>
+        <w:pageBreakBefore/>
+      </w:pPr>
+      <w:r>
+        <w:t>Lesson 25 Bottom row control</w:t>
+      </w:r>
+      <w:bookmarkEnd w:id="25"/>
+    </w:p>
+    <w:p>
+      <w:r>
+        <w:t>Type bottom-row letters without accidental spaces.</w:t>
+      </w:r>
+    </w:p>
+    <w:p>
+      <w:pPr>
+        <w:pStyle w:val="Heading2"/>
+      </w:pPr>
+      <w:r>
+        <w:t>Find the keys</w:t>
+      </w:r>
+    </w:p>
+    <w:p>
+      <w:r>
+        <w:t>The bottom letter row runs Z X C V B N M. The wide Spacebar is below it.</w:t>
+      </w:r>
+    </w:p>
+    <w:p>
+      <w:pPr>
+        <w:pStyle w:val="Heading2"/>
+      </w:pPr>
+      <w:r>
+        <w:t>Use your left hand</w:t>
+      </w:r>
+    </w:p>
+    <w:p>
+      <w:r>
+        <w:t>Near the centre, try left little on V, ring on B, middle on N, and index on M. Move left for Z X C.</w:t>
+      </w:r>
+    </w:p>
+    <w:p>
+      <w:pPr>
+        <w:pStyle w:val="Heading2"/>
+      </w:pPr>
+      <w:r>
+        <w:t>Step by step</w:t>
+      </w:r>
+    </w:p>
+    <w:p>
+      <w:pPr>
+        <w:numPr>
+          <w:ilvl w:val="0"/>
+          <w:numId w:val="36"/>
+        </w:numPr>
+      </w:pPr>
+      <w:r>
+        <w:t>Use short downward movements. Release each letter before using the thumb for Space. Reposition instead if a downward reach is awkward.</w:t>
+      </w:r>
+    </w:p>
+    <w:p>
+      <w:pPr>
+        <w:numPr>
+          <w:ilvl w:val="0"/>
+          <w:numId w:val="36"/>
+        </w:numPr>
+      </w:pPr>
+      <w:r>
+        <w:t>In a practice document, copy each practice line. Use Enter after each line. Review the result before repeating.</w:t>
+      </w:r>
+    </w:p>
+    <w:p>
+      <w:pPr>
+        <w:pStyle w:val="Heading2"/>
+      </w:pPr>
+      <w:r>
+        <w:t>Practice</w:t>
+      </w:r>
+    </w:p>
+    <w:p>
+      <w:pPr>
+        <w:pStyle w:val="Practice"/>
+      </w:pPr>
+      <w:r>
+        <w:t>mix box cabin move</w:t>
+      </w:r>
+    </w:p>
+    <w:p>
+      <w:pPr>
+        <w:pStyle w:val="Practice"/>
+      </w:pPr>
+      <w:r>
+        <w:t>Max can move six boxes.</w:t>
+      </w:r>
+    </w:p>
+    <w:p>
+      <w:pPr>
+        <w:pStyle w:val="Practice"/>
+      </w:pPr>
+      <w:r>
+        <w:t>Bring my blue bag back home.</w:t>
+      </w:r>
+    </w:p>
+    <w:p>
+      <w:pPr>
+        <w:pStyle w:val="Heading2"/>
+      </w:pPr>
+      <w:r>
+        <w:t>Check your work</w:t>
+      </w:r>
+    </w:p>
+    <w:p>
+      <w:r>
+        <w:t>Check N versus M, B versus V, and any spaces inside words.</w:t>
+      </w:r>
+    </w:p>
+    <w:p>
+      <w:bookmarkStart w:id="26" w:name="lesson26"/>
+      <w:pPr>
+        <w:pStyle w:val="Heading1"/>
+        <w:pageBreakBefore/>
+      </w:pPr>
+      <w:r>
+        <w:t>Lesson 26 Moving between rows</w:t>
+      </w:r>
+      <w:bookmarkEnd w:id="26"/>
+    </w:p>
+    <w:p>
+      <w:r>
+        <w:t>Combine outward and return movements across all letter rows.</w:t>
+      </w:r>
+    </w:p>
+    <w:p>
+      <w:pPr>
+        <w:pStyle w:val="Heading2"/>
+      </w:pPr>
+      <w:r>
+        <w:t>Find the keys</w:t>
+      </w:r>
+    </w:p>
+    <w:p>
+      <w:r>
+        <w:t>Use F or J to identify the middle row before moving up or down. The rows are staggered.</w:t>
+      </w:r>
+    </w:p>
+    <w:p>
+      <w:pPr>
+        <w:pStyle w:val="Heading2"/>
+      </w:pPr>
+      <w:r>
+        <w:t>Use your left hand</w:t>
+      </w:r>
+    </w:p>
+    <w:p>
+      <w:r>
+        <w:t>Move your left hand between rows as a unit for distant letters. Use the central finger pattern only where comfortable.</w:t>
+      </w:r>
+    </w:p>
+    <w:p>
+      <w:pPr>
+        <w:pStyle w:val="Heading2"/>
+      </w:pPr>
+      <w:r>
+        <w:t>Step by step</w:t>
+      </w:r>
+    </w:p>
+    <w:p>
+      <w:pPr>
+        <w:numPr>
+          <w:ilvl w:val="0"/>
+          <w:numId w:val="37"/>
+        </w:numPr>
+      </w:pPr>
+      <w:r>
+        <w:t>Read the next word before moving. Pause between words if needed; avoid stopping with a key held down.</w:t>
+      </w:r>
+    </w:p>
+    <w:p>
+      <w:pPr>
+        <w:numPr>
+          <w:ilvl w:val="0"/>
+          <w:numId w:val="37"/>
+        </w:numPr>
+      </w:pPr>
+      <w:r>
+        <w:t>In a practice document, copy each practice line. Use Enter after each line. Review the result before repeating.</w:t>
+      </w:r>
+    </w:p>
+    <w:p>
+      <w:pPr>
+        <w:pStyle w:val="Heading2"/>
+      </w:pPr>
+      <w:r>
+        <w:t>Practice</w:t>
+      </w:r>
+    </w:p>
+    <w:p>
+      <w:pPr>
+        <w:pStyle w:val="Practice"/>
+      </w:pPr>
+      <w:r>
+        <w:t>garden window basket</w:t>
+      </w:r>
+    </w:p>
+    <w:p>
+      <w:pPr>
+        <w:pStyle w:val="Practice"/>
+      </w:pPr>
+      <w:r>
+        <w:t>The blue basket is near the window.</w:t>
+      </w:r>
+    </w:p>
+    <w:p>
+      <w:pPr>
+        <w:pStyle w:val="Practice"/>
+      </w:pPr>
+      <w:r>
+        <w:t>I can move from row to row.</w:t>
+      </w:r>
+    </w:p>
+    <w:p>
+      <w:pPr>
+        <w:pStyle w:val="Heading2"/>
+      </w:pPr>
+      <w:r>
+        <w:t>Check your work</w:t>
+      </w:r>
+    </w:p>
+    <w:p>
+      <w:r>
+        <w:t>Which row change caused an error? Practise that movement, then retry the sentence.</w:t>
+      </w:r>
+    </w:p>
+    <w:p>
+      <w:bookmarkStart w:id="27" w:name="lesson27"/>
+      <w:pPr>
+        <w:pStyle w:val="Heading1"/>
+        <w:pageBreakBefore/>
+      </w:pPr>
+      <w:r>
+        <w:t>Lesson 27 Repeated letters</w:t>
+      </w:r>
+      <w:bookmarkEnd w:id="27"/>
+    </w:p>
+    <w:p>
+      <w:r>
+        <w:t>Press and release clearly when the same letter occurs twice.</w:t>
+      </w:r>
+    </w:p>
+    <w:p>
+      <w:pPr>
+        <w:pStyle w:val="Heading2"/>
+      </w:pPr>
+      <w:r>
+        <w:t>Find the keys</w:t>
+      </w:r>
+    </w:p>
+    <w:p>
+      <w:r>
+        <w:t>Repeated letters use the same key twice. The key must rise between presses.</w:t>
+      </w:r>
+    </w:p>
+    <w:p>
+      <w:pPr>
+        <w:pStyle w:val="Heading2"/>
+      </w:pPr>
+      <w:r>
+        <w:t>Use your left hand</w:t>
+      </w:r>
+    </w:p>
+    <w:p>
+      <w:r>
+        <w:t>Keep your left hand relaxed during doubled letters. Use the same controlled finger for both taps.</w:t>
+      </w:r>
+    </w:p>
+    <w:p>
+      <w:pPr>
+        <w:pStyle w:val="Heading2"/>
+      </w:pPr>
+      <w:r>
+        <w:t>Step by step</w:t>
+      </w:r>
+    </w:p>
+    <w:p>
+      <w:pPr>
+        <w:numPr>
+          <w:ilvl w:val="0"/>
+          <w:numId w:val="38"/>
+        </w:numPr>
+      </w:pPr>
+      <w:r>
+        <w:t>Say the doubled letters quietly or review them with speech. Tap twice with a full release rather than holding the key for automatic repetition.</w:t>
+      </w:r>
+    </w:p>
+    <w:p>
+      <w:pPr>
+        <w:numPr>
+          <w:ilvl w:val="0"/>
+          <w:numId w:val="38"/>
+        </w:numPr>
+      </w:pPr>
+      <w:r>
+        <w:t>In a practice document, copy each practice line. Use Enter after each line. Review the result before repeating.</w:t>
+      </w:r>
+    </w:p>
+    <w:p>
+      <w:pPr>
+        <w:pStyle w:val="Heading2"/>
+      </w:pPr>
+      <w:r>
+        <w:t>Practice</w:t>
+      </w:r>
+    </w:p>
+    <w:p>
+      <w:pPr>
+        <w:pStyle w:val="Practice"/>
+      </w:pPr>
+      <w:r>
+        <w:t>bookkeeper letter coffee</w:t>
+      </w:r>
+    </w:p>
+    <w:p>
+      <w:pPr>
+        <w:pStyle w:val="Practice"/>
+      </w:pPr>
+      <w:r>
+        <w:t>Jill will bring a yellow balloon.</w:t>
+      </w:r>
+    </w:p>
+    <w:p>
+      <w:pPr>
+        <w:pStyle w:val="Practice"/>
+      </w:pPr>
+      <w:r>
+        <w:t>I need a little more coffee.</w:t>
+      </w:r>
+    </w:p>
+    <w:p>
+      <w:pPr>
+        <w:pStyle w:val="Heading2"/>
+      </w:pPr>
+      <w:r>
+        <w:t>Check your work</w:t>
+      </w:r>
+    </w:p>
+    <w:p>
+      <w:r>
+        <w:t>Check that doubled letters appear exactly twice, especially in bookkeeper and balloon.</w:t>
+      </w:r>
+    </w:p>
+    <w:p>
+      <w:bookmarkStart w:id="28" w:name="lesson28"/>
+      <w:pPr>
+        <w:pStyle w:val="Heading1"/>
+        <w:pageBreakBefore/>
+      </w:pPr>
+      <w:r>
+        <w:t>Lesson 28 Longer words in small parts</w:t>
+      </w:r>
+      <w:bookmarkEnd w:id="28"/>
+    </w:p>
+    <w:p>
+      <w:r>
+        <w:t>Type longer words while keeping their spelling and spacing.</w:t>
+      </w:r>
+    </w:p>
+    <w:p>
+      <w:pPr>
+        <w:pStyle w:val="Heading2"/>
+      </w:pPr>
+      <w:r>
+        <w:t>Find the keys</w:t>
+      </w:r>
+    </w:p>
+    <w:p>
+      <w:r>
+        <w:t>All letters are already available. Use the tactile landmarks whenever a long word carries the hand away from the centre.</w:t>
+      </w:r>
+    </w:p>
+    <w:p>
+      <w:pPr>
+        <w:pStyle w:val="Heading2"/>
+      </w:pPr>
+      <w:r>
+        <w:t>Use your left hand</w:t>
+      </w:r>
+    </w:p>
+    <w:p>
+      <w:r>
+        <w:t>Move your left hand freely through each part of the word. Use a stronger left finger for distant keys.</w:t>
+      </w:r>
+    </w:p>
+    <w:p>
+      <w:pPr>
+        <w:pStyle w:val="Heading2"/>
+      </w:pPr>
+      <w:r>
+        <w:t>Step by step</w:t>
+      </w:r>
+    </w:p>
+    <w:p>
+      <w:pPr>
+        <w:numPr>
+          <w:ilvl w:val="0"/>
+          <w:numId w:val="39"/>
+        </w:numPr>
+      </w:pPr>
+      <w:r>
+        <w:t>Read or hear the whole word, then type it in small remembered parts. Do not insert spaces between parts of the same word.</w:t>
+      </w:r>
+    </w:p>
+    <w:p>
+      <w:pPr>
+        <w:numPr>
+          <w:ilvl w:val="0"/>
+          <w:numId w:val="39"/>
+        </w:numPr>
+      </w:pPr>
+      <w:r>
+        <w:t>In a practice document, copy each practice line. Use Enter after each line. Review the result before repeating.</w:t>
+      </w:r>
+    </w:p>
+    <w:p>
+      <w:pPr>
+        <w:pStyle w:val="Heading2"/>
+      </w:pPr>
+      <w:r>
+        <w:t>Practice</w:t>
+      </w:r>
+    </w:p>
+    <w:p>
+      <w:pPr>
+        <w:pStyle w:val="Practice"/>
+      </w:pPr>
+      <w:r>
+        <w:t>information conversation appointment</w:t>
+      </w:r>
+    </w:p>
+    <w:p>
+      <w:pPr>
+        <w:pStyle w:val="Practice"/>
+      </w:pPr>
+      <w:r>
+        <w:t>Please confirm the appointment.</w:t>
+      </w:r>
+    </w:p>
+    <w:p>
+      <w:pPr>
+        <w:pStyle w:val="Practice"/>
+      </w:pPr>
+      <w:r>
+        <w:t>The information is in my notebook.</w:t>
+      </w:r>
+    </w:p>
+    <w:p>
+      <w:pPr>
+        <w:pStyle w:val="Heading2"/>
+      </w:pPr>
+      <w:r>
+        <w:t>Check your work</w:t>
+      </w:r>
+    </w:p>
+    <w:p>
+      <w:r>
+        <w:t>Check the middle and ending of each long word, not just its first letters.</w:t>
+      </w:r>
+    </w:p>
+    <w:p>
+      <w:bookmarkStart w:id="29" w:name="lesson29"/>
+      <w:pPr>
+        <w:pStyle w:val="Heading1"/>
+        <w:pageBreakBefore/>
+      </w:pPr>
+      <w:r>
+        <w:t>Lesson 29 Sentence rhythm</w:t>
+      </w:r>
+      <w:bookmarkEnd w:id="29"/>
+    </w:p>
+    <w:p>
+      <w:r>
+        <w:t>Build an even rhythm through a complete sentence.</w:t>
+      </w:r>
+    </w:p>
+    <w:p>
+      <w:pPr>
+        <w:pStyle w:val="Heading2"/>
+      </w:pPr>
+      <w:r>
+        <w:t>Find the keys</w:t>
+      </w:r>
+    </w:p>
+    <w:p>
+      <w:r>
+        <w:t>Space separates words. A capital begins each sentence, and period ends it.</w:t>
+      </w:r>
+    </w:p>
+    <w:p>
+      <w:pPr>
+        <w:pStyle w:val="Heading2"/>
+      </w:pPr>
+      <w:r>
+        <w:t>Use your left hand</w:t>
+      </w:r>
+    </w:p>
+    <w:p>
+      <w:r>
+        <w:t>Use only your left hand for letters, Space, Shift, and period. Move to a modifier, release it, then continue with Sticky Keys.</w:t>
+      </w:r>
+    </w:p>
+    <w:p>
+      <w:pPr>
+        <w:pStyle w:val="Heading2"/>
+      </w:pPr>
+      <w:r>
+        <w:t>Step by step</w:t>
+      </w:r>
+    </w:p>
+    <w:p>
+      <w:pPr>
+        <w:numPr>
+          <w:ilvl w:val="0"/>
+          <w:numId w:val="40"/>
+        </w:numPr>
+      </w:pPr>
+      <w:r>
+        <w:t>Aim for a repeatable pace rather than maximum speed. With Sticky Keys on, press and release Shift once before the opening capital.</w:t>
+      </w:r>
+    </w:p>
+    <w:p>
+      <w:pPr>
+        <w:numPr>
+          <w:ilvl w:val="0"/>
+          <w:numId w:val="40"/>
+        </w:numPr>
+      </w:pPr>
+      <w:r>
+        <w:t>In a practice document, copy each practice line. Use Enter after each line. Review the result before repeating.</w:t>
+      </w:r>
+    </w:p>
+    <w:p>
+      <w:pPr>
+        <w:pStyle w:val="Heading2"/>
+      </w:pPr>
+      <w:r>
+        <w:t>Practice</w:t>
+      </w:r>
+    </w:p>
+    <w:p>
+      <w:pPr>
+        <w:pStyle w:val="Practice"/>
+      </w:pPr>
+      <w:r>
+        <w:t>I will read the sentence before I type.</w:t>
+      </w:r>
+    </w:p>
+    <w:p>
+      <w:pPr>
+        <w:pStyle w:val="Practice"/>
+      </w:pPr>
+      <w:r>
+        <w:t>A steady pace helps me place each letter.</w:t>
+      </w:r>
+    </w:p>
+    <w:p>
+      <w:pPr>
+        <w:pStyle w:val="Practice"/>
+      </w:pPr>
+      <w:r>
+        <w:t>I can pause between words and continue.</w:t>
+      </w:r>
+    </w:p>
+    <w:p>
+      <w:pPr>
+        <w:pStyle w:val="Heading2"/>
+      </w:pPr>
+      <w:r>
+        <w:t>Check your work</w:t>
+      </w:r>
+    </w:p>
+    <w:p>
+      <w:r>
+        <w:t>Check the opening capital, one space between words, and one final period.</w:t>
+      </w:r>
+    </w:p>
+    <w:p>
+      <w:bookmarkStart w:id="30" w:name="lesson30"/>
+      <w:pPr>
+        <w:pStyle w:val="Heading1"/>
+        <w:pageBreakBefore/>
+      </w:pPr>
+      <w:r>
+        <w:t>Lesson 30 Connected sentences</w:t>
+      </w:r>
+      <w:bookmarkEnd w:id="30"/>
+    </w:p>
+    <w:p>
+      <w:r>
+        <w:t>Copy a short paragraph in meaningful sections.</w:t>
+      </w:r>
+    </w:p>
+    <w:p>
+      <w:pPr>
+        <w:pStyle w:val="Heading2"/>
+      </w:pPr>
+      <w:r>
+        <w:t>Find the keys</w:t>
+      </w:r>
+    </w:p>
+    <w:p>
+      <w:r>
+        <w:t>A paragraph uses the same keys as its sentences. Keep the hand free to move for each word.</w:t>
+      </w:r>
+    </w:p>
+    <w:p>
+      <w:pPr>
+        <w:pStyle w:val="Heading2"/>
+      </w:pPr>
+      <w:r>
+        <w:t>Use your left hand</w:t>
+      </w:r>
+    </w:p>
+    <w:p>
+      <w:r>
+        <w:t>Use the left hand throughout each sentence, including its capital and period. Reset near F or J between groups.</w:t>
+      </w:r>
+    </w:p>
+    <w:p>
+      <w:pPr>
+        <w:pStyle w:val="Heading2"/>
+      </w:pPr>
+      <w:r>
+        <w:t>Step by step</w:t>
+      </w:r>
+    </w:p>
+    <w:p>
+      <w:pPr>
+        <w:numPr>
+          <w:ilvl w:val="0"/>
+          <w:numId w:val="41"/>
+        </w:numPr>
+      </w:pPr>
+      <w:r>
+        <w:t>Read all four sentences first. The website presents one sentence per group. In a practice document, join them with one space to make a paragraph.</w:t>
+      </w:r>
+    </w:p>
+    <w:p>
+      <w:pPr>
+        <w:numPr>
+          <w:ilvl w:val="0"/>
+          <w:numId w:val="41"/>
+        </w:numPr>
+      </w:pPr>
+      <w:r>
+        <w:t>Copy the sentences into your document using the paragraph breaks described above. Review the result before repeating.</w:t>
+      </w:r>
+    </w:p>
+    <w:p>
+      <w:pPr>
+        <w:pStyle w:val="Heading2"/>
+      </w:pPr>
+      <w:r>
+        <w:t>Practice</w:t>
+      </w:r>
+    </w:p>
+    <w:p>
+      <w:pPr>
+        <w:pStyle w:val="Practice"/>
+      </w:pPr>
+      <w:r>
+        <w:t>I opened my notebook this morning.</w:t>
+      </w:r>
+    </w:p>
+    <w:p>
+      <w:pPr>
+        <w:pStyle w:val="Practice"/>
+      </w:pPr>
+      <w:r>
+        <w:t>I wrote a short list for the day.</w:t>
+      </w:r>
+    </w:p>
+    <w:p>
+      <w:pPr>
+        <w:pStyle w:val="Practice"/>
+      </w:pPr>
+      <w:r>
+        <w:t>Then I checked the list and added a time.</w:t>
+      </w:r>
+    </w:p>
+    <w:p>
+      <w:pPr>
+        <w:pStyle w:val="Practice"/>
+      </w:pPr>
+      <w:r>
+        <w:t>Now my notes are ready to use.</w:t>
+      </w:r>
+    </w:p>
+    <w:p>
+      <w:pPr>
+        <w:pStyle w:val="Heading2"/>
+      </w:pPr>
+      <w:r>
+        <w:t>Check your work</w:t>
+      </w:r>
+    </w:p>
+    <w:p>
+      <w:r>
+        <w:t>Read the paragraph back in order and confirm that no sentence was skipped.</w:t>
+      </w:r>
+    </w:p>
+    <w:p>
+      <w:bookmarkStart w:id="31" w:name="lesson31"/>
+      <w:pPr>
+        <w:pStyle w:val="Heading1"/>
+        <w:pageBreakBefore/>
+      </w:pPr>
+      <w:r>
+        <w:t>Lesson 31 Amounts and decimal points</w:t>
+      </w:r>
+      <w:bookmarkEnd w:id="31"/>
+    </w:p>
+    <w:p>
+      <w:r>
+        <w:t>Type quantities and money accurately within messages.</w:t>
+      </w:r>
+    </w:p>
+    <w:p>
+      <w:pPr>
+        <w:pStyle w:val="Heading2"/>
+      </w:pPr>
+      <w:r>
+        <w:t>Find the keys</w:t>
+      </w:r>
+    </w:p>
+    <w:p>
+      <w:r>
+        <w:t>Use the top number row. Period separates the decimal part; Shift with 4 produces dollar sign on US QWERTY.</w:t>
+      </w:r>
+    </w:p>
+    <w:p>
+      <w:pPr>
+        <w:pStyle w:val="Heading2"/>
+      </w:pPr>
+      <w:r>
+        <w:t>Use your left hand</w:t>
+      </w:r>
+    </w:p>
+    <w:p>
+      <w:r>
+        <w:t>Move your left hand upward for digits and right for period. Refind F or J before returning to words.</w:t>
+      </w:r>
+    </w:p>
+    <w:p>
+      <w:pPr>
+        <w:pStyle w:val="Heading2"/>
+      </w:pPr>
+      <w:r>
+        <w:t>Step by step</w:t>
+      </w:r>
+    </w:p>
+    <w:p>
+      <w:pPr>
+        <w:numPr>
+          <w:ilvl w:val="0"/>
+          <w:numId w:val="42"/>
+        </w:numPr>
+      </w:pPr>
+      <w:r>
+        <w:t>Read amounts digit by digit. Use Sticky Keys for dollar sign, then release each digit normally. Keep one decimal point in each amount.</w:t>
+      </w:r>
+    </w:p>
+    <w:p>
+      <w:pPr>
+        <w:numPr>
+          <w:ilvl w:val="0"/>
+          <w:numId w:val="42"/>
+        </w:numPr>
+      </w:pPr>
+      <w:r>
+        <w:t>In a practice document, copy each practice line. Use Enter after each line. Review the result before repeating.</w:t>
+      </w:r>
+    </w:p>
+    <w:p>
+      <w:pPr>
+        <w:pStyle w:val="Heading2"/>
+      </w:pPr>
+      <w:r>
+        <w:t>Practice</w:t>
+      </w:r>
+    </w:p>
+    <w:p>
+      <w:pPr>
+        <w:pStyle w:val="Practice"/>
+      </w:pPr>
+      <w:r>
+        <w:t>The notebook costs $12.50.</w:t>
+      </w:r>
+    </w:p>
+    <w:p>
+      <w:pPr>
+        <w:pStyle w:val="Practice"/>
+      </w:pPr>
+      <w:r>
+        <w:t>I bought 3 pads for $7.20.</w:t>
+      </w:r>
+    </w:p>
+    <w:p>
+      <w:pPr>
+        <w:pStyle w:val="Practice"/>
+      </w:pPr>
+      <w:r>
+        <w:t>The total is $19.70 for 4 items.</w:t>
+      </w:r>
+    </w:p>
+    <w:p>
+      <w:pPr>
+        <w:pStyle w:val="Practice"/>
+      </w:pPr>
+      <w:r>
+        <w:t>Please bring $20.00.</w:t>
+      </w:r>
+    </w:p>
+    <w:p>
+      <w:pPr>
+        <w:pStyle w:val="Heading2"/>
+      </w:pPr>
+      <w:r>
+        <w:t>Check your work</w:t>
+      </w:r>
+    </w:p>
+    <w:p>
+      <w:r>
+        <w:t>Compare every digit with the target. Check zero versus O and one versus lowercase l.</w:t>
+      </w:r>
+    </w:p>
+    <w:p>
+      <w:bookmarkStart w:id="32" w:name="lesson32"/>
+      <w:pPr>
+        <w:pStyle w:val="Heading1"/>
+        <w:pageBreakBefore/>
+      </w:pPr>
+      <w:r>
+        <w:t>Lesson 32 Dates and appointment times</w:t>
+      </w:r>
+      <w:bookmarkEnd w:id="32"/>
+    </w:p>
+    <w:p>
+      <w:r>
+        <w:t>Enter dates and times without losing separators.</w:t>
+      </w:r>
+    </w:p>
+    <w:p>
+      <w:pPr>
+        <w:pStyle w:val="Heading2"/>
+      </w:pPr>
+      <w:r>
+        <w:t>Find the keys</w:t>
+      </w:r>
+    </w:p>
+    <w:p>
+      <w:r>
+        <w:t>Slash is right of period. Colon is Shift with semicolon, which is right of L.</w:t>
+      </w:r>
+    </w:p>
+    <w:p>
+      <w:pPr>
+        <w:pStyle w:val="Heading2"/>
+      </w:pPr>
+      <w:r>
+        <w:t>Use your left hand</w:t>
+      </w:r>
+    </w:p>
+    <w:p>
+      <w:r>
+        <w:t>Move your left hand between the number row and right-side punctuation. Use separate Shift and key presses with Sticky Keys.</w:t>
+      </w:r>
+    </w:p>
+    <w:p>
+      <w:pPr>
+        <w:pStyle w:val="Heading2"/>
+      </w:pPr>
+      <w:r>
+        <w:t>Step by step</w:t>
+      </w:r>
+    </w:p>
+    <w:p>
+      <w:pPr>
+        <w:numPr>
+          <w:ilvl w:val="0"/>
+          <w:numId w:val="43"/>
+        </w:numPr>
+      </w:pPr>
+      <w:r>
+        <w:t>These are copy exercises; date formats vary. Match the order shown, including slashes and colons, without guessing the next number.</w:t>
+      </w:r>
+    </w:p>
+    <w:p>
+      <w:pPr>
+        <w:numPr>
+          <w:ilvl w:val="0"/>
+          <w:numId w:val="43"/>
+        </w:numPr>
+      </w:pPr>
+      <w:r>
+        <w:t>In a practice document, copy each practice line. Use Enter after each line. Review the result before repeating.</w:t>
+      </w:r>
+    </w:p>
+    <w:p>
+      <w:pPr>
+        <w:pStyle w:val="Heading2"/>
+      </w:pPr>
+      <w:r>
+        <w:t>Practice</w:t>
+      </w:r>
+    </w:p>
+    <w:p>
+      <w:pPr>
+        <w:pStyle w:val="Practice"/>
+      </w:pPr>
+      <w:r>
+        <w:t>Appointment: 10/24/2026 at 9:15.</w:t>
+      </w:r>
+    </w:p>
+    <w:p>
+      <w:pPr>
+        <w:pStyle w:val="Practice"/>
+      </w:pPr>
+      <w:r>
+        <w:t>The class runs from 1:30 to 2:45.</w:t>
+      </w:r>
+    </w:p>
+    <w:p>
+      <w:pPr>
+        <w:pStyle w:val="Practice"/>
+      </w:pPr>
+      <w:r>
+        <w:t>Please arrive 10 minutes early.</w:t>
+      </w:r>
+    </w:p>
+    <w:p>
+      <w:pPr>
+        <w:pStyle w:val="Heading2"/>
+      </w:pPr>
+      <w:r>
+        <w:t>Check your work</w:t>
+      </w:r>
+    </w:p>
+    <w:p>
+      <w:r>
+        <w:t>Read each complete date and time back, then review the individual separators.</w:t>
+      </w:r>
+    </w:p>
+    <w:p>
+      <w:bookmarkStart w:id="33" w:name="lesson33"/>
+      <w:pPr>
+        <w:pStyle w:val="Heading1"/>
+        <w:pageBreakBefore/>
+      </w:pPr>
+      <w:r>
+        <w:t>Lesson 33 Names and practice addresses</w:t>
+      </w:r>
+      <w:bookmarkEnd w:id="33"/>
+    </w:p>
+    <w:p>
+      <w:r>
+        <w:t>Copy names and address lines with correct capitals.</w:t>
+      </w:r>
+    </w:p>
+    <w:p>
+      <w:pPr>
+        <w:pStyle w:val="Heading2"/>
+      </w:pPr>
+      <w:r>
+        <w:t>Find the keys</w:t>
+      </w:r>
+    </w:p>
+    <w:p>
+      <w:r>
+        <w:t>Capitals use Shift with a letter. Digits and comma were taught earlier.</w:t>
+      </w:r>
+    </w:p>
+    <w:p>
+      <w:pPr>
+        <w:pStyle w:val="Heading2"/>
+      </w:pPr>
+      <w:r>
+        <w:t>Use your left hand</w:t>
+      </w:r>
+    </w:p>
+    <w:p>
+      <w:r>
+        <w:t>Use your left hand for each capital by pressing and releasing Shift before the letter with Sticky Keys on.</w:t>
+      </w:r>
+    </w:p>
+    <w:p>
+      <w:pPr>
+        <w:pStyle w:val="Heading2"/>
+      </w:pPr>
+      <w:r>
+        <w:t>Step by step</w:t>
+      </w:r>
+    </w:p>
+    <w:p>
+      <w:pPr>
+        <w:numPr>
+          <w:ilvl w:val="0"/>
+          <w:numId w:val="44"/>
+        </w:numPr>
+      </w:pPr>
+      <w:r>
+        <w:t>Use this fictional address for practice. Copy the name and each line exactly. Move to the next group automatically on the website; use Enter between address lines in a document.</w:t>
+      </w:r>
+    </w:p>
+    <w:p>
+      <w:pPr>
+        <w:numPr>
+          <w:ilvl w:val="0"/>
+          <w:numId w:val="44"/>
+        </w:numPr>
+      </w:pPr>
+      <w:r>
+        <w:t>In a practice document, copy each practice line. Use Enter after each line. Review the result before repeating.</w:t>
+      </w:r>
+    </w:p>
+    <w:p>
+      <w:pPr>
+        <w:pStyle w:val="Heading2"/>
+      </w:pPr>
+      <w:r>
+        <w:t>Practice</w:t>
+      </w:r>
+    </w:p>
+    <w:p>
+      <w:pPr>
+        <w:pStyle w:val="Practice"/>
+      </w:pPr>
+      <w:r>
+        <w:t>Robin Lee</w:t>
+      </w:r>
+    </w:p>
+    <w:p>
+      <w:pPr>
+        <w:pStyle w:val="Practice"/>
+      </w:pPr>
+      <w:r>
+        <w:t>24 Maple Lane</w:t>
+      </w:r>
+    </w:p>
+    <w:p>
+      <w:pPr>
+        <w:pStyle w:val="Practice"/>
+      </w:pPr>
+      <w:r>
+        <w:t>Practice City, AB 12345</w:t>
+      </w:r>
+    </w:p>
+    <w:p>
+      <w:pPr>
+        <w:pStyle w:val="Practice"/>
+      </w:pPr>
+      <w:r>
+        <w:t>Please write the name on line 1.</w:t>
+      </w:r>
+    </w:p>
+    <w:p>
+      <w:pPr>
+        <w:pStyle w:val="Heading2"/>
+      </w:pPr>
+      <w:r>
+        <w:t>Check your work</w:t>
+      </w:r>
+    </w:p>
+    <w:p>
+      <w:r>
+        <w:t>Check the capitals and all five digits. Do not substitute personal contact information.</w:t>
+      </w:r>
+    </w:p>
+    <w:p>
+      <w:bookmarkStart w:id="34" w:name="lesson34"/>
+      <w:pPr>
+        <w:pStyle w:val="Heading1"/>
+        <w:pageBreakBefore/>
+      </w:pPr>
+      <w:r>
+        <w:t>Lesson 34 Questions and short replies</w:t>
+      </w:r>
+      <w:bookmarkEnd w:id="34"/>
+    </w:p>
+    <w:p>
+      <w:r>
+        <w:t>Distinguish questions, statements, and exclamations.</w:t>
+      </w:r>
+    </w:p>
+    <w:p>
+      <w:pPr>
+        <w:pStyle w:val="Heading2"/>
+      </w:pPr>
+      <w:r>
+        <w:t>Find the keys</w:t>
+      </w:r>
+    </w:p>
+    <w:p>
+      <w:r>
+        <w:t>Question mark is Shift with slash. Exclamation point is Shift with 1 on US QWERTY.</w:t>
+      </w:r>
+    </w:p>
+    <w:p>
+      <w:pPr>
+        <w:pStyle w:val="Heading2"/>
+      </w:pPr>
+      <w:r>
+        <w:t>Use your left hand</w:t>
+      </w:r>
+    </w:p>
+    <w:p>
+      <w:r>
+        <w:t>Move your left hand left for 1 and right for slash. With Sticky Keys, release Shift before travelling to either key.</w:t>
+      </w:r>
+    </w:p>
+    <w:p>
+      <w:pPr>
+        <w:pStyle w:val="Heading2"/>
+      </w:pPr>
+      <w:r>
+        <w:t>Step by step</w:t>
+      </w:r>
+    </w:p>
+    <w:p>
+      <w:pPr>
+        <w:numPr>
+          <w:ilvl w:val="0"/>
+          <w:numId w:val="45"/>
+        </w:numPr>
+      </w:pPr>
+      <w:r>
+        <w:t>Introduce exclamation point slowly: press and release Shift, then 1. Match each sentence ending rather than using period automatically.</w:t>
+      </w:r>
+    </w:p>
+    <w:p>
+      <w:pPr>
+        <w:numPr>
+          <w:ilvl w:val="0"/>
+          <w:numId w:val="45"/>
+        </w:numPr>
+      </w:pPr>
+      <w:r>
+        <w:t>In a practice document, copy each practice line. Use Enter after each line. Review the result before repeating.</w:t>
+      </w:r>
+    </w:p>
+    <w:p>
+      <w:pPr>
+        <w:pStyle w:val="Heading2"/>
+      </w:pPr>
+      <w:r>
+        <w:t>Practice</w:t>
+      </w:r>
+    </w:p>
+    <w:p>
+      <w:pPr>
+        <w:pStyle w:val="Practice"/>
+      </w:pPr>
+      <w:r>
+        <w:t>Are you ready?</w:t>
+      </w:r>
+    </w:p>
+    <w:p>
+      <w:pPr>
+        <w:pStyle w:val="Practice"/>
+      </w:pPr>
+      <w:r>
+        <w:t>Yes, I am ready.</w:t>
+      </w:r>
+    </w:p>
+    <w:p>
+      <w:pPr>
+        <w:pStyle w:val="Practice"/>
+      </w:pPr>
+      <w:r>
+        <w:t>That is great!</w:t>
+      </w:r>
+    </w:p>
+    <w:p>
+      <w:pPr>
+        <w:pStyle w:val="Practice"/>
+      </w:pPr>
+      <w:r>
+        <w:t>Can we begin at 9?</w:t>
+      </w:r>
+    </w:p>
+    <w:p>
+      <w:pPr>
+        <w:pStyle w:val="Heading2"/>
+      </w:pPr>
+      <w:r>
+        <w:t>Check your work</w:t>
+      </w:r>
+    </w:p>
+    <w:p>
+      <w:r>
+        <w:t>Check that each question ends with question mark and the exclamation has exactly one exclamation point.</w:t>
+      </w:r>
+    </w:p>
+    <w:p>
+      <w:bookmarkStart w:id="35" w:name="lesson35"/>
+      <w:pPr>
+        <w:pStyle w:val="Heading1"/>
+        <w:pageBreakBefore/>
+      </w:pPr>
+      <w:r>
+        <w:t>Lesson 35 Apostrophes in messages</w:t>
+      </w:r>
+      <w:bookmarkEnd w:id="35"/>
+    </w:p>
+    <w:p>
+      <w:r>
+        <w:t>Type contractions and ownership without extra spaces.</w:t>
+      </w:r>
+    </w:p>
+    <w:p>
+      <w:pPr>
+        <w:pStyle w:val="Heading2"/>
+      </w:pPr>
+      <w:r>
+        <w:t>Find the keys</w:t>
+      </w:r>
+    </w:p>
+    <w:p>
+      <w:r>
+        <w:t>Apostrophe is right of semicolon. It needs no Shift for these examples.</w:t>
+      </w:r>
+    </w:p>
+    <w:p>
+      <w:pPr>
+        <w:pStyle w:val="Heading2"/>
+      </w:pPr>
+      <w:r>
+        <w:t>Use your left hand</w:t>
+      </w:r>
+    </w:p>
+    <w:p>
+      <w:r>
+        <w:t>Move your left hand to apostrophe with an index or middle finger. Return toward J before the next word.</w:t>
+      </w:r>
+    </w:p>
+    <w:p>
+      <w:pPr>
+        <w:pStyle w:val="Heading2"/>
+      </w:pPr>
+      <w:r>
+        <w:t>Step by step</w:t>
+      </w:r>
+    </w:p>
+    <w:p>
+      <w:pPr>
+        <w:numPr>
+          <w:ilvl w:val="0"/>
+          <w:numId w:val="46"/>
+        </w:numPr>
+      </w:pPr>
+      <w:r>
+        <w:t>Keep the apostrophe inside the word. Read the complete word before typing so the punctuation does not break your spelling rhythm.</w:t>
+      </w:r>
+    </w:p>
+    <w:p>
+      <w:pPr>
+        <w:numPr>
+          <w:ilvl w:val="0"/>
+          <w:numId w:val="46"/>
+        </w:numPr>
+      </w:pPr>
+      <w:r>
+        <w:t>In a practice document, copy each practice line. Use Enter after each line. Review the result before repeating.</w:t>
+      </w:r>
+    </w:p>
+    <w:p>
+      <w:pPr>
+        <w:pStyle w:val="Heading2"/>
+      </w:pPr>
+      <w:r>
+        <w:t>Practice</w:t>
+      </w:r>
+    </w:p>
+    <w:p>
+      <w:pPr>
+        <w:pStyle w:val="Practice"/>
+      </w:pPr>
+      <w:r>
+        <w:t>I'm ready for today's class.</w:t>
+      </w:r>
+    </w:p>
+    <w:p>
+      <w:pPr>
+        <w:pStyle w:val="Practice"/>
+      </w:pPr>
+      <w:r>
+        <w:t>Sam's notebook is on Jill's desk.</w:t>
+      </w:r>
+    </w:p>
+    <w:p>
+      <w:pPr>
+        <w:pStyle w:val="Practice"/>
+      </w:pPr>
+      <w:r>
+        <w:t>We can't meet until 3.</w:t>
+      </w:r>
+    </w:p>
+    <w:p>
+      <w:pPr>
+        <w:pStyle w:val="Practice"/>
+      </w:pPr>
+      <w:r>
+        <w:t>I'll bring the team's notes.</w:t>
+      </w:r>
+    </w:p>
+    <w:p>
+      <w:pPr>
+        <w:pStyle w:val="Heading2"/>
+      </w:pPr>
+      <w:r>
+        <w:t>Check your work</w:t>
+      </w:r>
+    </w:p>
+    <w:p>
+      <w:r>
+        <w:t>Check that there is no space before or after an apostrophe inside a word.</w:t>
+      </w:r>
+    </w:p>
+    <w:p>
+      <w:bookmarkStart w:id="36" w:name="lesson36"/>
+      <w:pPr>
+        <w:pStyle w:val="Heading1"/>
+        <w:pageBreakBefore/>
+      </w:pPr>
+      <w:r>
+        <w:t>Lesson 36 Quotation marks and dialogue</w:t>
+      </w:r>
+      <w:bookmarkEnd w:id="36"/>
+    </w:p>
+    <w:p>
+      <w:r>
+        <w:t>Copy short quotations with opening and closing marks.</w:t>
+      </w:r>
+    </w:p>
+    <w:p>
+      <w:pPr>
+        <w:pStyle w:val="Heading2"/>
+      </w:pPr>
+      <w:r>
+        <w:t>Find the keys</w:t>
+      </w:r>
+    </w:p>
+    <w:p>
+      <w:r>
+        <w:t>On US QWERTY, quotation mark is Shift with apostrophe. Comma, question mark, and period remain separate keys.</w:t>
+      </w:r>
+    </w:p>
+    <w:p>
+      <w:pPr>
+        <w:pStyle w:val="Heading2"/>
+      </w:pPr>
+      <w:r>
+        <w:t>Use your left hand</w:t>
+      </w:r>
+    </w:p>
+    <w:p>
+      <w:r>
+        <w:t>Use your left hand to press and release Shift, then reach the apostrophe key with Sticky Keys on.</w:t>
+      </w:r>
+    </w:p>
+    <w:p>
+      <w:pPr>
+        <w:pStyle w:val="Heading2"/>
+      </w:pPr>
+      <w:r>
+        <w:t>Step by step</w:t>
+      </w:r>
+    </w:p>
+    <w:p>
+      <w:pPr>
+        <w:numPr>
+          <w:ilvl w:val="0"/>
+          <w:numId w:val="47"/>
+        </w:numPr>
+      </w:pPr>
+      <w:r>
+        <w:t>Read the whole group before typing. Check both quotation marks and their neighbouring punctuation. Use the straight quotation mark shown in the target.</w:t>
+      </w:r>
+    </w:p>
+    <w:p>
+      <w:pPr>
+        <w:numPr>
+          <w:ilvl w:val="0"/>
+          <w:numId w:val="47"/>
+        </w:numPr>
+      </w:pPr>
+      <w:r>
+        <w:t>In a practice document, copy each practice line. Use Enter after each line. Review the result before repeating.</w:t>
+      </w:r>
+    </w:p>
+    <w:p>
+      <w:pPr>
+        <w:pStyle w:val="Heading2"/>
+      </w:pPr>
+      <w:r>
+        <w:t>Practice</w:t>
+      </w:r>
+    </w:p>
+    <w:p>
+      <w:pPr>
+        <w:pStyle w:val="Practice"/>
+      </w:pPr>
+      <w:r>
+        <w:t>Sam said, "I can bring the notes."</w:t>
+      </w:r>
+    </w:p>
+    <w:p>
+      <w:pPr>
+        <w:pStyle w:val="Practice"/>
+      </w:pPr>
+      <w:r>
+        <w:t>"Can we meet at 2?" Jill asked.</w:t>
+      </w:r>
+    </w:p>
+    <w:p>
+      <w:pPr>
+        <w:pStyle w:val="Practice"/>
+      </w:pPr>
+      <w:r>
+        <w:t>"Yes," Sam replied.</w:t>
+      </w:r>
+    </w:p>
+    <w:p>
+      <w:pPr>
+        <w:pStyle w:val="Heading2"/>
+      </w:pPr>
+      <w:r>
+        <w:t>Check your work</w:t>
+      </w:r>
+    </w:p>
+    <w:p>
+      <w:r>
+        <w:t>Does every quotation have both an opening and closing mark?</w:t>
+      </w:r>
+    </w:p>
+    <w:p>
+      <w:bookmarkStart w:id="37" w:name="lesson37"/>
+      <w:pPr>
+        <w:pStyle w:val="Heading1"/>
+        <w:pageBreakBefore/>
+      </w:pPr>
+      <w:r>
+        <w:t>Lesson 37 Percentages in everyday text</w:t>
+      </w:r>
+      <w:bookmarkEnd w:id="37"/>
+    </w:p>
+    <w:p>
+      <w:r>
+        <w:t>Add percent signs to numbers in useful sentences.</w:t>
+      </w:r>
+    </w:p>
+    <w:p>
+      <w:pPr>
+        <w:pStyle w:val="Heading2"/>
+      </w:pPr>
+      <w:r>
+        <w:t>Find the keys</w:t>
+      </w:r>
+    </w:p>
+    <w:p>
+      <w:r>
+        <w:t>Percent sign is Shift with 5 on the top number row of US QWERTY.</w:t>
+      </w:r>
+    </w:p>
+    <w:p>
+      <w:pPr>
+        <w:pStyle w:val="Heading2"/>
+      </w:pPr>
+      <w:r>
+        <w:t>Use your left hand</w:t>
+      </w:r>
+    </w:p>
+    <w:p>
+      <w:r>
+        <w:t>Move your left hand toward 5. With Sticky Keys, press and release Shift, then tap 5 with a controlled finger.</w:t>
+      </w:r>
+    </w:p>
+    <w:p>
+      <w:pPr>
+        <w:pStyle w:val="Heading2"/>
+      </w:pPr>
+      <w:r>
+        <w:t>Step by step</w:t>
+      </w:r>
+    </w:p>
+    <w:p>
+      <w:pPr>
+        <w:numPr>
+          <w:ilvl w:val="0"/>
+          <w:numId w:val="48"/>
+        </w:numPr>
+      </w:pPr>
+      <w:r>
+        <w:t>Introduce percent sign by locating 5 first. In these examples there is no space between the number and percent sign.</w:t>
+      </w:r>
+    </w:p>
+    <w:p>
+      <w:pPr>
+        <w:numPr>
+          <w:ilvl w:val="0"/>
+          <w:numId w:val="48"/>
+        </w:numPr>
+      </w:pPr>
+      <w:r>
+        <w:t>In a practice document, copy each practice line. Use Enter after each line. Review the result before repeating.</w:t>
+      </w:r>
+    </w:p>
+    <w:p>
+      <w:pPr>
+        <w:pStyle w:val="Heading2"/>
+      </w:pPr>
+      <w:r>
+        <w:t>Practice</w:t>
+      </w:r>
+    </w:p>
+    <w:p>
+      <w:pPr>
+        <w:pStyle w:val="Practice"/>
+      </w:pPr>
+      <w:r>
+        <w:t>The battery is at 75%.</w:t>
+      </w:r>
+    </w:p>
+    <w:p>
+      <w:pPr>
+        <w:pStyle w:val="Practice"/>
+      </w:pPr>
+      <w:r>
+        <w:t>I finished 50% of the list.</w:t>
+      </w:r>
+    </w:p>
+    <w:p>
+      <w:pPr>
+        <w:pStyle w:val="Practice"/>
+      </w:pPr>
+      <w:r>
+        <w:t>The discount is 10%.</w:t>
+      </w:r>
+    </w:p>
+    <w:p>
+      <w:pPr>
+        <w:pStyle w:val="Practice"/>
+      </w:pPr>
+      <w:r>
+        <w:t>We checked 100% of the pages.</w:t>
+      </w:r>
+    </w:p>
+    <w:p>
+      <w:pPr>
+        <w:pStyle w:val="Heading2"/>
+      </w:pPr>
+      <w:r>
+        <w:t>Check your work</w:t>
+      </w:r>
+    </w:p>
+    <w:p>
+      <w:r>
+        <w:t>Review the digits, percent sign, and final period as separate characters.</w:t>
+      </w:r>
+    </w:p>
+    <w:p>
+      <w:bookmarkStart w:id="38" w:name="lesson38"/>
+      <w:pPr>
+        <w:pStyle w:val="Heading1"/>
+        <w:pageBreakBefore/>
+      </w:pPr>
+      <w:r>
+        <w:t>Lesson 38 Number signs and labels</w:t>
+      </w:r>
+      <w:bookmarkEnd w:id="38"/>
+    </w:p>
+    <w:p>
+      <w:r>
+        <w:t>Use number signs in room and item labels.</w:t>
+      </w:r>
+    </w:p>
+    <w:p>
+      <w:pPr>
+        <w:pStyle w:val="Heading2"/>
+      </w:pPr>
+      <w:r>
+        <w:t>Find the keys</w:t>
+      </w:r>
+    </w:p>
+    <w:p>
+      <w:r>
+        <w:t>Number sign is Shift with 3 on US QWERTY. It is also called hash.</w:t>
+      </w:r>
+    </w:p>
+    <w:p>
+      <w:pPr>
+        <w:pStyle w:val="Heading2"/>
+      </w:pPr>
+      <w:r>
+        <w:t>Use your left hand</w:t>
+      </w:r>
+    </w:p>
+    <w:p>
+      <w:r>
+        <w:t>Move your left hand to 3 after a separate Shift press with Sticky Keys on.</w:t>
+      </w:r>
+    </w:p>
+    <w:p>
+      <w:pPr>
+        <w:pStyle w:val="Heading2"/>
+      </w:pPr>
+      <w:r>
+        <w:t>Step by step</w:t>
+      </w:r>
+    </w:p>
+    <w:p>
+      <w:pPr>
+        <w:numPr>
+          <w:ilvl w:val="0"/>
+          <w:numId w:val="49"/>
+        </w:numPr>
+      </w:pPr>
+      <w:r>
+        <w:t>Locate 3 before starting. Type number sign immediately before the digits in each label. Use the same hand for the modifier and the digit.</w:t>
+      </w:r>
+    </w:p>
+    <w:p>
+      <w:pPr>
+        <w:numPr>
+          <w:ilvl w:val="0"/>
+          <w:numId w:val="49"/>
+        </w:numPr>
+      </w:pPr>
+      <w:r>
+        <w:t>In a practice document, copy each practice line. Use Enter after each line. Review the result before repeating.</w:t>
+      </w:r>
+    </w:p>
+    <w:p>
+      <w:pPr>
+        <w:pStyle w:val="Heading2"/>
+      </w:pPr>
+      <w:r>
+        <w:t>Practice</w:t>
+      </w:r>
+    </w:p>
+    <w:p>
+      <w:pPr>
+        <w:pStyle w:val="Practice"/>
+      </w:pPr>
+      <w:r>
+        <w:t>Open folder #3.</w:t>
+      </w:r>
+    </w:p>
+    <w:p>
+      <w:pPr>
+        <w:pStyle w:val="Practice"/>
+      </w:pPr>
+      <w:r>
+        <w:t>The meeting is in Room #12.</w:t>
+      </w:r>
+    </w:p>
+    <w:p>
+      <w:pPr>
+        <w:pStyle w:val="Practice"/>
+      </w:pPr>
+      <w:r>
+        <w:t>Please check item #8 on page 4.</w:t>
+      </w:r>
+    </w:p>
+    <w:p>
+      <w:pPr>
+        <w:pStyle w:val="Heading2"/>
+      </w:pPr>
+      <w:r>
+        <w:t>Check your work</w:t>
+      </w:r>
+    </w:p>
+    <w:p>
+      <w:r>
+        <w:t>Check that number sign appears before the number rather than after it.</w:t>
+      </w:r>
+    </w:p>
+    <w:p>
+      <w:bookmarkStart w:id="39" w:name="lesson39"/>
+      <w:pPr>
+        <w:pStyle w:val="Heading1"/>
+        <w:pageBreakBefore/>
+      </w:pPr>
+      <w:r>
+        <w:t>Lesson 39 Ampersands in names</w:t>
+      </w:r>
+      <w:bookmarkEnd w:id="39"/>
+    </w:p>
+    <w:p>
+      <w:r>
+        <w:t>Type ampersands within short names and labels.</w:t>
+      </w:r>
+    </w:p>
+    <w:p>
+      <w:pPr>
+        <w:pStyle w:val="Heading2"/>
+      </w:pPr>
+      <w:r>
+        <w:t>Find the keys</w:t>
+      </w:r>
+    </w:p>
+    <w:p>
+      <w:r>
+        <w:t>Ampersand is Shift with 7 on the US number row.</w:t>
+      </w:r>
+    </w:p>
+    <w:p>
+      <w:pPr>
+        <w:pStyle w:val="Heading2"/>
+      </w:pPr>
+      <w:r>
+        <w:t>Use your left hand</w:t>
+      </w:r>
+    </w:p>
+    <w:p>
+      <w:r>
+        <w:t>Move your left hand right along the number row to 7. Use Sticky Keys so the hand can move after releasing Shift.</w:t>
+      </w:r>
+    </w:p>
+    <w:p>
+      <w:pPr>
+        <w:pStyle w:val="Heading2"/>
+      </w:pPr>
+      <w:r>
+        <w:t>Step by step</w:t>
+      </w:r>
+    </w:p>
+    <w:p>
+      <w:pPr>
+        <w:numPr>
+          <w:ilvl w:val="0"/>
+          <w:numId w:val="50"/>
+        </w:numPr>
+      </w:pPr>
+      <w:r>
+        <w:t>Introduce ampersand with a separate Shift press followed by 7. Include the spaces on both sides when the target has them.</w:t>
+      </w:r>
+    </w:p>
+    <w:p>
+      <w:pPr>
+        <w:numPr>
+          <w:ilvl w:val="0"/>
+          <w:numId w:val="50"/>
+        </w:numPr>
+      </w:pPr>
+      <w:r>
+        <w:t>In a practice document, copy each practice line. Use Enter after each line. Review the result before repeating.</w:t>
+      </w:r>
+    </w:p>
+    <w:p>
+      <w:pPr>
+        <w:pStyle w:val="Heading2"/>
+      </w:pPr>
+      <w:r>
+        <w:t>Practice</w:t>
+      </w:r>
+    </w:p>
+    <w:p>
+      <w:pPr>
+        <w:pStyle w:val="Practice"/>
+      </w:pPr>
+      <w:r>
+        <w:t>Pens &amp; Paper</w:t>
+      </w:r>
+    </w:p>
+    <w:p>
+      <w:pPr>
+        <w:pStyle w:val="Practice"/>
+      </w:pPr>
+      <w:r>
+        <w:t>Sam &amp; Jill will help today.</w:t>
+      </w:r>
+    </w:p>
+    <w:p>
+      <w:pPr>
+        <w:pStyle w:val="Practice"/>
+      </w:pPr>
+      <w:r>
+        <w:t>Copy the label: Notes &amp; Files.</w:t>
+      </w:r>
+    </w:p>
+    <w:p>
+      <w:pPr>
+        <w:pStyle w:val="Heading2"/>
+      </w:pPr>
+      <w:r>
+        <w:t>Check your work</w:t>
+      </w:r>
+    </w:p>
+    <w:p>
+      <w:r>
+        <w:t>Check the ampersand and its spaces without substituting the word and.</w:t>
+      </w:r>
+    </w:p>
+    <w:p>
+      <w:bookmarkStart w:id="40" w:name="lesson40"/>
+      <w:pPr>
+        <w:pStyle w:val="Heading1"/>
+        <w:pageBreakBefore/>
+      </w:pPr>
+      <w:r>
+        <w:t>Lesson 40 Hyphens and underscores</w:t>
+      </w:r>
+      <w:bookmarkEnd w:id="40"/>
+    </w:p>
+    <w:p>
+      <w:r>
+        <w:t>Distinguish hyphens from underscores in labels and filenames.</w:t>
+      </w:r>
+    </w:p>
+    <w:p>
+      <w:pPr>
+        <w:pStyle w:val="Heading2"/>
+      </w:pPr>
+      <w:r>
+        <w:t>Find the keys</w:t>
+      </w:r>
+    </w:p>
+    <w:p>
+      <w:r>
+        <w:t>Hyphen is the key immediately right of 0. Shift with that key produces underscore.</w:t>
+      </w:r>
+    </w:p>
+    <w:p>
+      <w:pPr>
+        <w:pStyle w:val="Heading2"/>
+      </w:pPr>
+      <w:r>
+        <w:t>Use your left hand</w:t>
+      </w:r>
+    </w:p>
+    <w:p>
+      <w:r>
+        <w:t>Move your left hand to the right end of the number row. Use an index or middle finger for hyphen and Sticky Keys for underscore.</w:t>
+      </w:r>
+    </w:p>
+    <w:p>
+      <w:pPr>
+        <w:pStyle w:val="Heading2"/>
+      </w:pPr>
+      <w:r>
+        <w:t>Step by step</w:t>
+      </w:r>
+    </w:p>
+    <w:p>
+      <w:pPr>
+        <w:numPr>
+          <w:ilvl w:val="0"/>
+          <w:numId w:val="51"/>
+        </w:numPr>
+      </w:pPr>
+      <w:r>
+        <w:t>Practise hyphen without Shift, then underscore with a separate Shift press. Filenames here are copy text; saving is practised in your text editor.</w:t>
+      </w:r>
+    </w:p>
+    <w:p>
+      <w:pPr>
+        <w:numPr>
+          <w:ilvl w:val="0"/>
+          <w:numId w:val="51"/>
+        </w:numPr>
+      </w:pPr>
+      <w:r>
+        <w:t>In a practice document, copy each practice line. Use Enter after each line. Review the result before repeating.</w:t>
+      </w:r>
+    </w:p>
+    <w:p>
+      <w:pPr>
+        <w:pStyle w:val="Heading2"/>
+      </w:pPr>
+      <w:r>
+        <w:t>Practice</w:t>
+      </w:r>
+    </w:p>
+    <w:p>
+      <w:pPr>
+        <w:pStyle w:val="Practice"/>
+      </w:pPr>
+      <w:r>
+        <w:t>part-time step-by-step</w:t>
+      </w:r>
+    </w:p>
+    <w:p>
+      <w:pPr>
+        <w:pStyle w:val="Practice"/>
+      </w:pPr>
+      <w:r>
+        <w:t>Save as class_notes_2.txt.</w:t>
+      </w:r>
+    </w:p>
+    <w:p>
+      <w:pPr>
+        <w:pStyle w:val="Practice"/>
+      </w:pPr>
+      <w:r>
+        <w:t>The label is follow-up_notes.</w:t>
+      </w:r>
+    </w:p>
+    <w:p>
+      <w:pPr>
+        <w:pStyle w:val="Heading2"/>
+      </w:pPr>
+      <w:r>
+        <w:t>Check your work</w:t>
+      </w:r>
+    </w:p>
+    <w:p>
+      <w:r>
+        <w:t>Check the exact separator and verify that there are no spaces inside the filename.</w:t>
+      </w:r>
+    </w:p>
+    <w:p>
+      <w:bookmarkStart w:id="41" w:name="lesson41"/>
+      <w:pPr>
+        <w:pStyle w:val="Heading1"/>
+        <w:pageBreakBefore/>
+      </w:pPr>
+      <w:r>
+        <w:t>Lesson 41 Comparison signs</w:t>
+      </w:r>
+      <w:bookmarkEnd w:id="41"/>
+    </w:p>
+    <w:p>
+      <w:r>
+        <w:t>Type less-than and greater-than signs in simple comparisons.</w:t>
+      </w:r>
+    </w:p>
+    <w:p>
+      <w:pPr>
+        <w:pStyle w:val="Heading2"/>
+      </w:pPr>
+      <w:r>
+        <w:t>Find the keys</w:t>
+      </w:r>
+    </w:p>
+    <w:p>
+      <w:r>
+        <w:t>Less-than is Shift with comma. Greater-than is Shift with period on US QWERTY.</w:t>
+      </w:r>
+    </w:p>
+    <w:p>
+      <w:pPr>
+        <w:pStyle w:val="Heading2"/>
+      </w:pPr>
+      <w:r>
+        <w:t>Use your left hand</w:t>
+      </w:r>
+    </w:p>
+    <w:p>
+      <w:r>
+        <w:t>Move your left hand right to comma or period after pressing and releasing Shift with Sticky Keys on.</w:t>
+      </w:r>
+    </w:p>
+    <w:p>
+      <w:pPr>
+        <w:pStyle w:val="Heading2"/>
+      </w:pPr>
+      <w:r>
+        <w:t>Step by step</w:t>
+      </w:r>
+    </w:p>
+    <w:p>
+      <w:pPr>
+        <w:numPr>
+          <w:ilvl w:val="0"/>
+          <w:numId w:val="52"/>
+        </w:numPr>
+      </w:pPr>
+      <w:r>
+        <w:t>Locate comma and period before adding Shift. Read the direction of the sign and match one space on each side in these examples.</w:t>
+      </w:r>
+    </w:p>
+    <w:p>
+      <w:pPr>
+        <w:numPr>
+          <w:ilvl w:val="0"/>
+          <w:numId w:val="52"/>
+        </w:numPr>
+      </w:pPr>
+      <w:r>
+        <w:t>In a practice document, copy each practice line. Use Enter after each line. Review the result before repeating.</w:t>
+      </w:r>
+    </w:p>
+    <w:p>
+      <w:pPr>
+        <w:pStyle w:val="Heading2"/>
+      </w:pPr>
+      <w:r>
+        <w:t>Practice</w:t>
+      </w:r>
+    </w:p>
+    <w:p>
+      <w:pPr>
+        <w:pStyle w:val="Practice"/>
+      </w:pPr>
+      <w:r>
+        <w:t>2 &lt; 5</w:t>
+      </w:r>
+    </w:p>
+    <w:p>
+      <w:pPr>
+        <w:pStyle w:val="Practice"/>
+      </w:pPr>
+      <w:r>
+        <w:t>9 &gt; 4</w:t>
+      </w:r>
+    </w:p>
+    <w:p>
+      <w:pPr>
+        <w:pStyle w:val="Practice"/>
+      </w:pPr>
+      <w:r>
+        <w:t>The comparison is 12 &lt; 20.</w:t>
+      </w:r>
+    </w:p>
+    <w:p>
+      <w:pPr>
+        <w:pStyle w:val="Practice"/>
+      </w:pPr>
+      <w:r>
+        <w:t>Check both: 8 &gt; 3 and 6 &lt; 10.</w:t>
+      </w:r>
+    </w:p>
+    <w:p>
+      <w:pPr>
+        <w:pStyle w:val="Heading2"/>
+      </w:pPr>
+      <w:r>
+        <w:t>Check your work</w:t>
+      </w:r>
+    </w:p>
+    <w:p>
+      <w:r>
+        <w:t>Check that each sign points in the same direction as the target.</w:t>
+      </w:r>
+    </w:p>
+    <w:p>
+      <w:bookmarkStart w:id="42" w:name="lesson42"/>
+      <w:pPr>
+        <w:pStyle w:val="Heading1"/>
+        <w:pageBreakBefore/>
+      </w:pPr>
+      <w:r>
+        <w:t>Lesson 42 Square brackets</w:t>
+      </w:r>
+      <w:bookmarkEnd w:id="42"/>
+    </w:p>
+    <w:p>
+      <w:r>
+        <w:t>Enter paired square brackets around a short note.</w:t>
+      </w:r>
+    </w:p>
+    <w:p>
+      <w:pPr>
+        <w:pStyle w:val="Heading2"/>
+      </w:pPr>
+      <w:r>
+        <w:t>Find the keys</w:t>
+      </w:r>
+    </w:p>
+    <w:p>
+      <w:r>
+        <w:t>The two bracket keys are immediately right of P. Press them without Shift for square brackets.</w:t>
+      </w:r>
+    </w:p>
+    <w:p>
+      <w:pPr>
+        <w:pStyle w:val="Heading2"/>
+      </w:pPr>
+      <w:r>
+        <w:t>Use your left hand</w:t>
+      </w:r>
+    </w:p>
+    <w:p>
+      <w:r>
+        <w:t>Move your left hand right past P. Use an index or middle finger for each bracket, then return toward J.</w:t>
+      </w:r>
+    </w:p>
+    <w:p>
+      <w:pPr>
+        <w:pStyle w:val="Heading2"/>
+      </w:pPr>
+      <w:r>
+        <w:t>Step by step</w:t>
+      </w:r>
+    </w:p>
+    <w:p>
+      <w:pPr>
+        <w:numPr>
+          <w:ilvl w:val="0"/>
+          <w:numId w:val="53"/>
+        </w:numPr>
+      </w:pPr>
+      <w:r>
+        <w:t>Locate opening bracket, then closing bracket. Copy both marks in order and include spaces only where shown.</w:t>
+      </w:r>
+    </w:p>
+    <w:p>
+      <w:pPr>
+        <w:numPr>
+          <w:ilvl w:val="0"/>
+          <w:numId w:val="53"/>
+        </w:numPr>
+      </w:pPr>
+      <w:r>
+        <w:t>In a practice document, copy each practice line. Use Enter after each line. Review the result before repeating.</w:t>
+      </w:r>
+    </w:p>
+    <w:p>
+      <w:pPr>
+        <w:pStyle w:val="Heading2"/>
+      </w:pPr>
+      <w:r>
+        <w:t>Practice</w:t>
+      </w:r>
+    </w:p>
+    <w:p>
+      <w:pPr>
+        <w:pStyle w:val="Practice"/>
+      </w:pPr>
+      <w:r>
+        <w:t>[Note] Bring a pen.</w:t>
+      </w:r>
+    </w:p>
+    <w:p>
+      <w:pPr>
+        <w:pStyle w:val="Practice"/>
+      </w:pPr>
+      <w:r>
+        <w:t>The file is [ready].</w:t>
+      </w:r>
+    </w:p>
+    <w:p>
+      <w:pPr>
+        <w:pStyle w:val="Practice"/>
+      </w:pPr>
+      <w:r>
+        <w:t>Read pages [2-4] before class.</w:t>
+      </w:r>
+    </w:p>
+    <w:p>
+      <w:pPr>
+        <w:pStyle w:val="Heading2"/>
+      </w:pPr>
+      <w:r>
+        <w:t>Check your work</w:t>
+      </w:r>
+    </w:p>
+    <w:p>
+      <w:r>
+        <w:t>Check that every opening bracket has a closing bracket.</w:t>
+      </w:r>
+    </w:p>
+    <w:p>
+      <w:bookmarkStart w:id="43" w:name="lesson43"/>
+      <w:pPr>
+        <w:pStyle w:val="Heading1"/>
+        <w:pageBreakBefore/>
+      </w:pPr>
+      <w:r>
+        <w:t>Lesson 43 Braces backslash and vertical bar</w:t>
+      </w:r>
+      <w:bookmarkEnd w:id="43"/>
+    </w:p>
+    <w:p>
+      <w:r>
+        <w:t>Learn the remaining symbols near the right edge.</w:t>
+      </w:r>
+    </w:p>
+    <w:p>
+      <w:pPr>
+        <w:pStyle w:val="Heading2"/>
+      </w:pPr>
+      <w:r>
+        <w:t>Find the keys</w:t>
+      </w:r>
+    </w:p>
+    <w:p>
+      <w:r>
+        <w:t>Shift with the bracket keys makes braces. Backslash is usually above Enter or beside the brackets on US keyboards; Shift with it makes vertical bar.</w:t>
+      </w:r>
+    </w:p>
+    <w:p>
+      <w:pPr>
+        <w:pStyle w:val="Heading2"/>
+      </w:pPr>
+      <w:r>
+        <w:t>Use your left hand</w:t>
+      </w:r>
+    </w:p>
+    <w:p>
+      <w:r>
+        <w:t>Move your left hand to the right edge for these keys. With Sticky Keys, release Shift before reaching the bracket or backslash key.</w:t>
+      </w:r>
+    </w:p>
+    <w:p>
+      <w:pPr>
+        <w:pStyle w:val="Heading2"/>
+      </w:pPr>
+      <w:r>
+        <w:t>Step by step</w:t>
+      </w:r>
+    </w:p>
+    <w:p>
+      <w:pPr>
+        <w:numPr>
+          <w:ilvl w:val="0"/>
+          <w:numId w:val="54"/>
+        </w:numPr>
+      </w:pPr>
+      <w:r>
+        <w:t>Confirm the backslash key on your keyboard before typing. These are copy examples, not commands to run. Distinguish backslash from the forward slash beside period.</w:t>
+      </w:r>
+    </w:p>
+    <w:p>
+      <w:pPr>
+        <w:numPr>
+          <w:ilvl w:val="0"/>
+          <w:numId w:val="54"/>
+        </w:numPr>
+      </w:pPr>
+      <w:r>
+        <w:t>In a practice document, copy each practice line. Use Enter after each line. Review the result before repeating.</w:t>
+      </w:r>
+    </w:p>
+    <w:p>
+      <w:pPr>
+        <w:pStyle w:val="Heading2"/>
+      </w:pPr>
+      <w:r>
+        <w:t>Practice</w:t>
+      </w:r>
+    </w:p>
+    <w:p>
+      <w:pPr>
+        <w:pStyle w:val="Practice"/>
+      </w:pPr>
+      <w:r>
+        <w:t>{note} {ready}</w:t>
+      </w:r>
+    </w:p>
+    <w:p>
+      <w:pPr>
+        <w:pStyle w:val="Practice"/>
+      </w:pPr>
+      <w:r>
+        <w:t>C:\Practice\notes.txt</w:t>
+      </w:r>
+    </w:p>
+    <w:p>
+      <w:pPr>
+        <w:pStyle w:val="Practice"/>
+      </w:pPr>
+      <w:r>
+        <w:t>Name | Date | Task</w:t>
+      </w:r>
+    </w:p>
+    <w:p>
+      <w:pPr>
+        <w:pStyle w:val="Heading2"/>
+      </w:pPr>
+      <w:r>
+        <w:t>Check your work</w:t>
+      </w:r>
+    </w:p>
+    <w:p>
+      <w:r>
+        <w:t>Review each paired brace, each backslash, and each vertical bar individually.</w:t>
+      </w:r>
+    </w:p>
+    <w:p>
+      <w:bookmarkStart w:id="44" w:name="lesson44"/>
+      <w:pPr>
+        <w:pStyle w:val="Heading1"/>
+        <w:pageBreakBefore/>
+      </w:pPr>
+      <w:r>
+        <w:t>Lesson 44 Asterisks and carets</w:t>
+      </w:r>
+      <w:bookmarkEnd w:id="44"/>
+    </w:p>
+    <w:p>
+      <w:r>
+        <w:t>Type two more shifted symbols from the number row.</w:t>
+      </w:r>
+    </w:p>
+    <w:p>
+      <w:pPr>
+        <w:pStyle w:val="Heading2"/>
+      </w:pPr>
+      <w:r>
+        <w:t>Find the keys</w:t>
+      </w:r>
+    </w:p>
+    <w:p>
+      <w:r>
+        <w:t>Asterisk is Shift with 8. Caret is Shift with 6 on US QWERTY.</w:t>
+      </w:r>
+    </w:p>
+    <w:p>
+      <w:pPr>
+        <w:pStyle w:val="Heading2"/>
+      </w:pPr>
+      <w:r>
+        <w:t>Use your left hand</w:t>
+      </w:r>
+    </w:p>
+    <w:p>
+      <w:r>
+        <w:t>Move your left hand along the number row to 8 or 6. Release Shift first with Sticky Keys, then move to the target.</w:t>
+      </w:r>
+    </w:p>
+    <w:p>
+      <w:pPr>
+        <w:pStyle w:val="Heading2"/>
+      </w:pPr>
+      <w:r>
+        <w:t>Step by step</w:t>
+      </w:r>
+    </w:p>
+    <w:p>
+      <w:pPr>
+        <w:numPr>
+          <w:ilvl w:val="0"/>
+          <w:numId w:val="55"/>
+        </w:numPr>
+      </w:pPr>
+      <w:r>
+        <w:t>Locate each base digit before adding Shift. These are literal typing examples; do not interpret them as an application command or calculation.</w:t>
+      </w:r>
+    </w:p>
+    <w:p>
+      <w:pPr>
+        <w:numPr>
+          <w:ilvl w:val="0"/>
+          <w:numId w:val="55"/>
+        </w:numPr>
+      </w:pPr>
+      <w:r>
+        <w:t>In a practice document, copy each practice line. Use Enter after each line. Review the result before repeating.</w:t>
+      </w:r>
+    </w:p>
+    <w:p>
+      <w:pPr>
+        <w:pStyle w:val="Heading2"/>
+      </w:pPr>
+      <w:r>
+        <w:t>Practice</w:t>
+      </w:r>
+    </w:p>
+    <w:p>
+      <w:pPr>
+        <w:pStyle w:val="Practice"/>
+      </w:pPr>
+      <w:r>
+        <w:t>* Required field</w:t>
+      </w:r>
+    </w:p>
+    <w:p>
+      <w:pPr>
+        <w:pStyle w:val="Practice"/>
+      </w:pPr>
+      <w:r>
+        <w:t>Copy the pattern: 2^3.</w:t>
+      </w:r>
+    </w:p>
+    <w:p>
+      <w:pPr>
+        <w:pStyle w:val="Practice"/>
+      </w:pPr>
+      <w:r>
+        <w:t>The label is *note*.</w:t>
+      </w:r>
+    </w:p>
+    <w:p>
+      <w:pPr>
+        <w:pStyle w:val="Heading2"/>
+      </w:pPr>
+      <w:r>
+        <w:t>Check your work</w:t>
+      </w:r>
+    </w:p>
+    <w:p>
+      <w:r>
+        <w:t>Check asterisk versus the letter x and caret versus an apostrophe.</w:t>
+      </w:r>
+    </w:p>
+    <w:p>
+      <w:bookmarkStart w:id="45" w:name="lesson45"/>
+      <w:pPr>
+        <w:pStyle w:val="Heading1"/>
+        <w:pageBreakBefore/>
+      </w:pPr>
+      <w:r>
+        <w:t>Lesson 45 Grave accents and tildes</w:t>
+      </w:r>
+      <w:bookmarkEnd w:id="45"/>
+    </w:p>
+    <w:p>
+      <w:r>
+        <w:t>Locate the last US QWERTY printable symbol key.</w:t>
+      </w:r>
+    </w:p>
+    <w:p>
+      <w:pPr>
+        <w:pStyle w:val="Heading2"/>
+      </w:pPr>
+      <w:r>
+        <w:t>Find the keys</w:t>
+      </w:r>
+    </w:p>
+    <w:p>
+      <w:r>
+        <w:t>On many US keyboards, the grave accent key is immediately left of 1. Shift with that key makes tilde.</w:t>
+      </w:r>
+    </w:p>
+    <w:p>
+      <w:pPr>
+        <w:pStyle w:val="Heading2"/>
+      </w:pPr>
+      <w:r>
+        <w:t>Use your left hand</w:t>
+      </w:r>
+    </w:p>
+    <w:p>
+      <w:r>
+        <w:t>Move your left hand to the far left of the number row. Use a controlled finger, and release Shift before tilde with Sticky Keys.</w:t>
+      </w:r>
+    </w:p>
+    <w:p>
+      <w:pPr>
+        <w:pStyle w:val="Heading2"/>
+      </w:pPr>
+      <w:r>
+        <w:t>Step by step</w:t>
+      </w:r>
+    </w:p>
+    <w:p>
+      <w:pPr>
+        <w:numPr>
+          <w:ilvl w:val="0"/>
+          <w:numId w:val="56"/>
+        </w:numPr>
+      </w:pPr>
+      <w:r>
+        <w:t>Confirm the key label on your keyboard. Grave accent is different from the apostrophe beside semicolon. These marks are practice text only.</w:t>
+      </w:r>
+    </w:p>
+    <w:p>
+      <w:pPr>
+        <w:numPr>
+          <w:ilvl w:val="0"/>
+          <w:numId w:val="56"/>
+        </w:numPr>
+      </w:pPr>
+      <w:r>
+        <w:t>In a practice document, copy each practice line. Use Enter after each line. Review the result before repeating.</w:t>
+      </w:r>
+    </w:p>
+    <w:p>
+      <w:pPr>
+        <w:pStyle w:val="Heading2"/>
+      </w:pPr>
+      <w:r>
+        <w:t>Practice</w:t>
+      </w:r>
+    </w:p>
+    <w:p>
+      <w:pPr>
+        <w:pStyle w:val="Practice"/>
+      </w:pPr>
+      <w:r>
+        <w:t>`note`</w:t>
+      </w:r>
+    </w:p>
+    <w:p>
+      <w:pPr>
+        <w:pStyle w:val="Practice"/>
+      </w:pPr>
+      <w:r>
+        <w:t>~draft~</w:t>
+      </w:r>
+    </w:p>
+    <w:p>
+      <w:pPr>
+        <w:pStyle w:val="Practice"/>
+      </w:pPr>
+      <w:r>
+        <w:t>Copy exactly: `file_2` and ~5.</w:t>
+      </w:r>
+    </w:p>
+    <w:p>
+      <w:pPr>
+        <w:pStyle w:val="Heading2"/>
+      </w:pPr>
+      <w:r>
+        <w:t>Check your work</w:t>
+      </w:r>
+    </w:p>
+    <w:p>
+      <w:r>
+        <w:t>Check that the grave accents slope differently from ordinary apostrophes and that tildes match the target.</w:t>
+      </w:r>
+    </w:p>
+    <w:p>
+      <w:bookmarkStart w:id="46" w:name="lesson46"/>
+      <w:pPr>
+        <w:pStyle w:val="Heading1"/>
+        <w:pageBreakBefore/>
+      </w:pPr>
+      <w:r>
+        <w:t>Lesson 46 Email addresses and web addresses</w:t>
+      </w:r>
+      <w:bookmarkEnd w:id="46"/>
+    </w:p>
+    <w:p>
+      <w:r>
+        <w:t>Copy common address patterns accurately.</w:t>
+      </w:r>
+    </w:p>
+    <w:p>
+      <w:pPr>
+        <w:pStyle w:val="Heading2"/>
+      </w:pPr>
+      <w:r>
+        <w:t>Find the keys</w:t>
+      </w:r>
+    </w:p>
+    <w:p>
+      <w:r>
+        <w:t>At sign is Shift with 2. Period, hyphen, underscore, colon, and slash have all been introduced.</w:t>
+      </w:r>
+    </w:p>
+    <w:p>
+      <w:pPr>
+        <w:pStyle w:val="Heading2"/>
+      </w:pPr>
+      <w:r>
+        <w:t>Use your left hand</w:t>
+      </w:r>
+    </w:p>
+    <w:p>
+      <w:r>
+        <w:t>Move your left hand across the whole keyboard for each address. Use Sticky Keys for at sign or colon, then return to ordinary letters.</w:t>
+      </w:r>
+    </w:p>
+    <w:p>
+      <w:pPr>
+        <w:pStyle w:val="Heading2"/>
+      </w:pPr>
+      <w:r>
+        <w:t>Step by step</w:t>
+      </w:r>
+    </w:p>
+    <w:p>
+      <w:pPr>
+        <w:numPr>
+          <w:ilvl w:val="0"/>
+          <w:numId w:val="57"/>
+        </w:numPr>
+      </w:pPr>
+      <w:r>
+        <w:t>These reserved example addresses are typing practice only. Do not send a message or open a link. Type each address without internal spaces.</w:t>
+      </w:r>
+    </w:p>
+    <w:p>
+      <w:pPr>
+        <w:numPr>
+          <w:ilvl w:val="0"/>
+          <w:numId w:val="57"/>
+        </w:numPr>
+      </w:pPr>
+      <w:r>
+        <w:t>In a practice document, copy each practice line. Use Enter after each line. Review the result before repeating.</w:t>
+      </w:r>
+    </w:p>
+    <w:p>
+      <w:pPr>
+        <w:pStyle w:val="Heading2"/>
+      </w:pPr>
+      <w:r>
+        <w:t>Practice</w:t>
+      </w:r>
+    </w:p>
+    <w:p>
+      <w:pPr>
+        <w:pStyle w:val="Practice"/>
+      </w:pPr>
+      <w:r>
+        <w:t>sam.lee@example.com</w:t>
+      </w:r>
+    </w:p>
+    <w:p>
+      <w:pPr>
+        <w:pStyle w:val="Practice"/>
+      </w:pPr>
+      <w:r>
+        <w:t>class_notes@example.org</w:t>
+      </w:r>
+    </w:p>
+    <w:p>
+      <w:pPr>
+        <w:pStyle w:val="Practice"/>
+      </w:pPr>
+      <w:r>
+        <w:t>https://example.com/notes</w:t>
+      </w:r>
+    </w:p>
+    <w:p>
+      <w:pPr>
+        <w:pStyle w:val="Practice"/>
+      </w:pPr>
+      <w:r>
+        <w:t>Please copy the address exactly.</w:t>
+      </w:r>
+    </w:p>
+    <w:p>
+      <w:pPr>
+        <w:pStyle w:val="Heading2"/>
+      </w:pPr>
+      <w:r>
+        <w:t>Check your work</w:t>
+      </w:r>
+    </w:p>
+    <w:p>
+      <w:r>
+        <w:t>Review the address character by character, especially at sign, periods, and slashes.</w:t>
+      </w:r>
+    </w:p>
+    <w:p>
+      <w:bookmarkStart w:id="47" w:name="lesson47"/>
+      <w:pPr>
+        <w:pStyle w:val="Heading1"/>
+        <w:pageBreakBefore/>
+      </w:pPr>
+      <w:r>
+        <w:t>Lesson 47 Numbered instructions</w:t>
+      </w:r>
+      <w:bookmarkEnd w:id="47"/>
+    </w:p>
+    <w:p>
+      <w:r>
+        <w:t>Type a short ordered list with consistent formatting.</w:t>
+      </w:r>
+    </w:p>
+    <w:p>
+      <w:pPr>
+        <w:pStyle w:val="Heading2"/>
+      </w:pPr>
+      <w:r>
+        <w:t>Find the keys</w:t>
+      </w:r>
+    </w:p>
+    <w:p>
+      <w:r>
+        <w:t>Digits, periods, capitals, and Space form the numbered steps. Enter makes a new line in a document.</w:t>
+      </w:r>
+    </w:p>
+    <w:p>
+      <w:pPr>
+        <w:pStyle w:val="Heading2"/>
+      </w:pPr>
+      <w:r>
+        <w:t>Use your left hand</w:t>
+      </w:r>
+    </w:p>
+    <w:p>
+      <w:r>
+        <w:t>Use your left hand for every part of the list, including numbers and capitals. Refind F or J between steps.</w:t>
+      </w:r>
+    </w:p>
+    <w:p>
+      <w:pPr>
+        <w:pStyle w:val="Heading2"/>
+      </w:pPr>
+      <w:r>
+        <w:t>Step by step</w:t>
+      </w:r>
+    </w:p>
+    <w:p>
+      <w:pPr>
+        <w:numPr>
+          <w:ilvl w:val="0"/>
+          <w:numId w:val="58"/>
+        </w:numPr>
+      </w:pPr>
+      <w:r>
+        <w:t>Copy the instructions as text. In the website each step is one group. In your document put each numbered step on a new line using Enter with the same hand.</w:t>
+      </w:r>
+    </w:p>
+    <w:p>
+      <w:pPr>
+        <w:numPr>
+          <w:ilvl w:val="0"/>
+          <w:numId w:val="58"/>
+        </w:numPr>
+      </w:pPr>
+      <w:r>
+        <w:t>In a practice document, copy each practice line. Use Enter after each line. Review the result before repeating.</w:t>
+      </w:r>
+    </w:p>
+    <w:p>
+      <w:pPr>
+        <w:pStyle w:val="Heading2"/>
+      </w:pPr>
+      <w:r>
+        <w:t>Practice</w:t>
+      </w:r>
+    </w:p>
+    <w:p>
+      <w:pPr>
+        <w:pStyle w:val="Practice"/>
+      </w:pPr>
+      <w:r>
+        <w:t>1. Open the practice document.</w:t>
+      </w:r>
+    </w:p>
+    <w:p>
+      <w:pPr>
+        <w:pStyle w:val="Practice"/>
+      </w:pPr>
+      <w:r>
+        <w:t>2. Type a short note.</w:t>
+      </w:r>
+    </w:p>
+    <w:p>
+      <w:pPr>
+        <w:pStyle w:val="Practice"/>
+      </w:pPr>
+      <w:r>
+        <w:t>3. Check the spelling and punctuation.</w:t>
+      </w:r>
+    </w:p>
+    <w:p>
+      <w:pPr>
+        <w:pStyle w:val="Practice"/>
+      </w:pPr>
+      <w:r>
+        <w:t>4. Save the note in Documents.</w:t>
+      </w:r>
+    </w:p>
+    <w:p>
+      <w:pPr>
+        <w:pStyle w:val="Heading2"/>
+      </w:pPr>
+      <w:r>
+        <w:t>Check your work</w:t>
+      </w:r>
+    </w:p>
+    <w:p>
+      <w:r>
+        <w:t>Check the step numbers, periods, and the single space before each opening word.</w:t>
+      </w:r>
+    </w:p>
+    <w:p>
+      <w:bookmarkStart w:id="48" w:name="lesson48"/>
+      <w:pPr>
+        <w:pStyle w:val="Heading1"/>
+        <w:pageBreakBefore/>
+      </w:pPr>
+      <w:r>
+        <w:t>Lesson 48 A practical work message</w:t>
+      </w:r>
+      <w:bookmarkEnd w:id="48"/>
+    </w:p>
+    <w:p>
+      <w:r>
+        <w:t>Combine details into a clear multi-line message.</w:t>
+      </w:r>
+    </w:p>
+    <w:p>
+      <w:pPr>
+        <w:pStyle w:val="Heading2"/>
+      </w:pPr>
+      <w:r>
+        <w:t>Find the keys</w:t>
+      </w:r>
+    </w:p>
+    <w:p>
+      <w:r>
+        <w:t>This message combines capitals, punctuation, a time, a room label, a percentage, and a filename.</w:t>
+      </w:r>
+    </w:p>
+    <w:p>
+      <w:pPr>
+        <w:pStyle w:val="Heading2"/>
+      </w:pPr>
+      <w:r>
+        <w:t>Use your left hand</w:t>
+      </w:r>
+    </w:p>
+    <w:p>
+      <w:r>
+        <w:t>Use only the left hand for the entire message. Move rather than stretching for digits, symbols, or final punctuation.</w:t>
+      </w:r>
+    </w:p>
+    <w:p>
+      <w:pPr>
+        <w:pStyle w:val="Heading2"/>
+      </w:pPr>
+      <w:r>
+        <w:t>Step by step</w:t>
+      </w:r>
+    </w:p>
+    <w:p>
+      <w:pPr>
+        <w:numPr>
+          <w:ilvl w:val="0"/>
+          <w:numId w:val="59"/>
+        </w:numPr>
+      </w:pPr>
+      <w:r>
+        <w:t>Read the complete message first. Copy one line at a time and check its details before continuing. Use separate Shift presses with Sticky Keys for shifted symbols.</w:t>
+      </w:r>
+    </w:p>
+    <w:p>
+      <w:pPr>
+        <w:numPr>
+          <w:ilvl w:val="0"/>
+          <w:numId w:val="59"/>
+        </w:numPr>
+      </w:pPr>
+      <w:r>
+        <w:t>In a practice document, copy each practice line. Use Enter after each line. Review the result before repeating.</w:t>
+      </w:r>
+    </w:p>
+    <w:p>
+      <w:pPr>
+        <w:pStyle w:val="Heading2"/>
+      </w:pPr>
+      <w:r>
+        <w:t>Practice</w:t>
+      </w:r>
+    </w:p>
+    <w:p>
+      <w:pPr>
+        <w:pStyle w:val="Practice"/>
+      </w:pPr>
+      <w:r>
+        <w:t>Hello Jill,</w:t>
+      </w:r>
+    </w:p>
+    <w:p>
+      <w:pPr>
+        <w:pStyle w:val="Practice"/>
+      </w:pPr>
+      <w:r>
+        <w:t>We will meet at 10:30 in Room #4.</w:t>
+      </w:r>
+    </w:p>
+    <w:p>
+      <w:pPr>
+        <w:pStyle w:val="Practice"/>
+      </w:pPr>
+      <w:r>
+        <w:t>The notes are 90% complete.</w:t>
+      </w:r>
+    </w:p>
+    <w:p>
+      <w:pPr>
+        <w:pStyle w:val="Practice"/>
+      </w:pPr>
+      <w:r>
+        <w:t>Please bring class_notes_2.txt.</w:t>
+      </w:r>
+    </w:p>
+    <w:p>
+      <w:pPr>
+        <w:pStyle w:val="Practice"/>
+      </w:pPr>
+      <w:r>
+        <w:t>Thank you, Sam.</w:t>
+      </w:r>
+    </w:p>
+    <w:p>
+      <w:pPr>
+        <w:pStyle w:val="Heading2"/>
+      </w:pPr>
+      <w:r>
+        <w:t>Check your work</w:t>
+      </w:r>
+    </w:p>
+    <w:p>
+      <w:r>
+        <w:t>Confirm the name, time, room number, percentage, and filename against the target.</w:t>
+      </w:r>
+    </w:p>
+    <w:p>
+      <w:bookmarkStart w:id="49" w:name="lesson49"/>
+      <w:pPr>
+        <w:pStyle w:val="Heading1"/>
+        <w:pageBreakBefore/>
+      </w:pPr>
+      <w:r>
+        <w:t>Lesson 49 Sustained paragraph practice</w:t>
+      </w:r>
+      <w:bookmarkEnd w:id="49"/>
+    </w:p>
+    <w:p>
+      <w:r>
+        <w:t>Maintain accuracy through two connected paragraphs.</w:t>
+      </w:r>
+    </w:p>
+    <w:p>
+      <w:pPr>
+        <w:pStyle w:val="Heading2"/>
+      </w:pPr>
+      <w:r>
+        <w:t>Find the keys</w:t>
+      </w:r>
+    </w:p>
+    <w:p>
+      <w:r>
+        <w:t>No new keys are introduced. Plan returns to the tactile landmarks between phrases, and take breaks between groups.</w:t>
+      </w:r>
+    </w:p>
+    <w:p>
+      <w:pPr>
+        <w:pStyle w:val="Heading2"/>
+      </w:pPr>
+      <w:r>
+        <w:t>Use your left hand</w:t>
+      </w:r>
+    </w:p>
+    <w:p>
+      <w:r>
+        <w:t>Keep the left hand free to move for every row. Use the finger choices that have been most reliable in earlier lessons.</w:t>
+      </w:r>
+    </w:p>
+    <w:p>
+      <w:pPr>
+        <w:pStyle w:val="Heading2"/>
+      </w:pPr>
+      <w:r>
+        <w:t>Step by step</w:t>
+      </w:r>
+    </w:p>
+    <w:p>
+      <w:pPr>
+        <w:numPr>
+          <w:ilvl w:val="0"/>
+          <w:numId w:val="60"/>
+        </w:numPr>
+      </w:pPr>
+      <w:r>
+        <w:t>The first three sentences form one paragraph; the last three form another. The website shows one sentence per group. In a document, separate the paragraphs with Enter. Timing remains optional.</w:t>
+      </w:r>
+    </w:p>
+    <w:p>
+      <w:pPr>
+        <w:numPr>
+          <w:ilvl w:val="0"/>
+          <w:numId w:val="60"/>
+        </w:numPr>
+      </w:pPr>
+      <w:r>
+        <w:t>Copy the sentences into your document using the paragraph breaks described above. Review the result before repeating.</w:t>
+      </w:r>
+    </w:p>
+    <w:p>
+      <w:pPr>
+        <w:pStyle w:val="Heading2"/>
+      </w:pPr>
+      <w:r>
+        <w:t>Practice</w:t>
+      </w:r>
+    </w:p>
+    <w:p>
+      <w:pPr>
+        <w:pStyle w:val="Practice"/>
+      </w:pPr>
+      <w:r>
+        <w:t>This morning I opened my practice file.</w:t>
+      </w:r>
+    </w:p>
+    <w:p>
+      <w:pPr>
+        <w:pStyle w:val="Practice"/>
+      </w:pPr>
+      <w:r>
+        <w:t>I typed a message about the meeting at 2:30.</w:t>
+      </w:r>
+    </w:p>
+    <w:p>
+      <w:pPr>
+        <w:pStyle w:val="Practice"/>
+      </w:pPr>
+      <w:r>
+        <w:t>Then I checked the names, numbers, and punctuation.</w:t>
+      </w:r>
+    </w:p>
+    <w:p>
+      <w:pPr>
+        <w:pStyle w:val="Practice"/>
+      </w:pPr>
+      <w:r>
+        <w:t>After a short break, I read the message again.</w:t>
+      </w:r>
+    </w:p>
+    <w:p>
+      <w:pPr>
+        <w:pStyle w:val="Practice"/>
+      </w:pPr>
+      <w:r>
+        <w:t>I corrected one word and saved my work.</w:t>
+      </w:r>
+    </w:p>
+    <w:p>
+      <w:pPr>
+        <w:pStyle w:val="Practice"/>
+      </w:pPr>
+      <w:r>
+        <w:t>The finished note was clear and ready to use.</w:t>
+      </w:r>
+    </w:p>
+    <w:p>
+      <w:pPr>
+        <w:pStyle w:val="Heading2"/>
+      </w:pPr>
+      <w:r>
+        <w:t>Check your work</w:t>
+      </w:r>
+    </w:p>
+    <w:p>
+      <w:r>
+        <w:t>Review sentence order and spacing. Record where a pause helped you keep control.</w:t>
+      </w:r>
+    </w:p>
+    <w:p>
+      <w:bookmarkStart w:id="50" w:name="lesson50"/>
+      <w:pPr>
+        <w:pStyle w:val="Heading1"/>
+        <w:pageBreakBefore/>
+      </w:pPr>
+      <w:r>
+        <w:t>Lesson 50 Final one hand typing challenge</w:t>
+      </w:r>
+      <w:bookmarkEnd w:id="50"/>
+    </w:p>
+    <w:p>
+      <w:r>
+        <w:t>Use the complete course to produce a useful, accurate message.</w:t>
+      </w:r>
+    </w:p>
+    <w:p>
+      <w:pPr>
+        <w:pStyle w:val="Heading2"/>
+      </w:pPr>
+      <w:r>
+        <w:t>Find the keys</w:t>
+      </w:r>
+    </w:p>
+    <w:p>
+      <w:r>
+        <w:t>Use the letter rows, number row, and punctuation routes from the course. No help from the other hand is required.</w:t>
+      </w:r>
+    </w:p>
+    <w:p>
+      <w:pPr>
+        <w:pStyle w:val="Heading2"/>
+      </w:pPr>
+      <w:r>
+        <w:t>Use your left hand</w:t>
+      </w:r>
+    </w:p>
+    <w:p>
+      <w:r>
+        <w:t>Complete every key press with your left hand, including modifiers and Space. Reposition freely and use your established finger adaptations.</w:t>
+      </w:r>
+    </w:p>
+    <w:p>
+      <w:pPr>
+        <w:pStyle w:val="Heading2"/>
+      </w:pPr>
+      <w:r>
+        <w:t>Step by step</w:t>
+      </w:r>
+    </w:p>
+    <w:p>
+      <w:pPr>
+        <w:numPr>
+          <w:ilvl w:val="0"/>
+          <w:numId w:val="61"/>
+        </w:numPr>
+      </w:pPr>
+      <w:r>
+        <w:t>Copy the message carefully. After the website practice, use a separate document to add a sentence of your own, correct an error, save, and reopen the file. Use Sticky Keys for shortcuts, one key at a time. Completion is based on accuracy; speed is optional.</w:t>
+      </w:r>
+    </w:p>
+    <w:p>
+      <w:pPr>
+        <w:numPr>
+          <w:ilvl w:val="0"/>
+          <w:numId w:val="61"/>
+        </w:numPr>
+      </w:pPr>
+      <w:r>
+        <w:t>In a practice document, copy each practice line. Use Enter after each line. Review the result before repeating.</w:t>
+      </w:r>
+    </w:p>
+    <w:p>
+      <w:pPr>
+        <w:pStyle w:val="Heading2"/>
+      </w:pPr>
+      <w:r>
+        <w:t>Practice</w:t>
+      </w:r>
+    </w:p>
+    <w:p>
+      <w:pPr>
+        <w:pStyle w:val="Practice"/>
+      </w:pPr>
+      <w:r>
+        <w:t>Hello Robin,</w:t>
+      </w:r>
+    </w:p>
+    <w:p>
+      <w:pPr>
+        <w:pStyle w:val="Practice"/>
+      </w:pPr>
+      <w:r>
+        <w:t>Our next class is on 10/24/2026 at 9:15.</w:t>
+      </w:r>
+    </w:p>
+    <w:p>
+      <w:pPr>
+        <w:pStyle w:val="Practice"/>
+      </w:pPr>
+      <w:r>
+        <w:t>Please bring 2 notebooks and a pen to Room #3.</w:t>
+      </w:r>
+    </w:p>
+    <w:p>
+      <w:pPr>
+        <w:pStyle w:val="Practice"/>
+      </w:pPr>
+      <w:r>
+        <w:t>The notebooks cost $12.50, including a 10% discount.</w:t>
+      </w:r>
+    </w:p>
+    <w:p>
+      <w:pPr>
+        <w:pStyle w:val="Practice"/>
+      </w:pPr>
+      <w:r>
+        <w:t>Save your notes as class_notes_3.txt.</w:t>
+      </w:r>
+    </w:p>
+    <w:p>
+      <w:pPr>
+        <w:pStyle w:val="Practice"/>
+      </w:pPr>
+      <w:r>
+        <w:t>Can you reply to class_notes@example.org?</w:t>
+      </w:r>
+    </w:p>
+    <w:p>
+      <w:pPr>
+        <w:pStyle w:val="Practice"/>
+      </w:pPr>
+      <w:r>
+        <w:t>Thank you for your help!</w:t>
+      </w:r>
+    </w:p>
+    <w:p>
+      <w:pPr>
+        <w:pStyle w:val="Heading2"/>
+      </w:pPr>
+      <w:r>
+        <w:t>Check your work</w:t>
+      </w:r>
+    </w:p>
+    <w:p>
+      <w:r>
+        <w:t>Check every detail and confirm the saved file in your editor. Record which tasks you completed independently and which you want to repeat.</w:t>
+      </w:r>
+    </w:p>
+    <w:p>
+      <w:bookmarkStart w:id="104" w:name="timed"/>
+      <w:pPr>
+        <w:pStyle w:val="Heading1"/>
+        <w:pageBreakBefore/>
+      </w:pPr>
+      <w:r>
+        <w:t>Timed practice</w:t>
+      </w:r>
+      <w:bookmarkEnd w:id="104"/>
+    </w:p>
+    <w:p>
+      <w:r>
+        <w:t>Use timed practice after Lesson 20, when the full passage is familiar. Timing is optional. Ask someone else to run the timer or use an accessible timer. Keep the same text, settings, and correction rule when comparing attempts.</w:t>
+      </w:r>
+    </w:p>
+    <w:p>
+      <w:pPr>
+        <w:pStyle w:val="Heading2"/>
+      </w:pPr>
+      <w:r>
+        <w:t>Choose a comfortable duration</w:t>
+      </w:r>
+    </w:p>
+    <w:p>
+      <w:pPr>
+        <w:pStyle w:val="ListBullet"/>
+      </w:pPr>
+      <w:r>
+        <w:t>1 minute: Establish a baseline. Stop when the timer ends, even in the middle of a sentence.</w:t>
+      </w:r>
+    </w:p>
+    <w:p>
+      <w:pPr>
+        <w:pStyle w:val="ListBullet"/>
+      </w:pPr>
+      <w:r>
+        <w:t>3 minutes: Try after shorter practice is comfortable. Include reading and correction time in the score.</w:t>
+      </w:r>
+    </w:p>
+    <w:p>
+      <w:pPr>
+        <w:pStyle w:val="ListBullet"/>
+      </w:pPr>
+      <w:r>
+        <w:t>6 minutes: Use only if the duration is comfortable. You may stop earlier. Record the actual time; never turn fatigue into a pass or fail test.</w:t>
+      </w:r>
+    </w:p>
+    <w:p>
+      <w:pPr>
+        <w:pStyle w:val="Heading2"/>
+      </w:pPr>
+      <w:r>
+        <w:t>Passage to copy</w:t>
+      </w:r>
+    </w:p>
+    <w:p>
+      <w:pPr>
+        <w:pStyle w:val="Practice"/>
+      </w:pPr>
+      <w:r>
+        <w:t>Today I will write a short note. I can move my hand to each key and return to the centre when I need to. My goal is clear, useful writing. I will check the spaces, capitals, and punctuation before I save my work. Sam needs 4 pens and 2 pads for the meeting at 2:30. The pens cost $3.50. Can we bring the blue folder, too? I will read the note again and correct any mistakes. Each careful practice session helps me learn my own pattern.</w:t>
+      </w:r>
+    </w:p>
+    <w:p>
+      <w:r>
+        <w:t>If you finish early, type one space and begin the passage again. Count letters, digits, spaces, and punctuation in the final text. Do not count Enter or correction keys as characters.</w:t>
+      </w:r>
+    </w:p>
+    <w:p>
+      <w:pPr>
+        <w:pStyle w:val="Heading2"/>
+      </w:pPr>
+      <w:r>
+        <w:t>Calculate speed</w:t>
+      </w:r>
+    </w:p>
+    <w:p>
+      <w:r>
+        <w:t>Gross words per minute equals final typed characters divided by 5, then divided by minutes. For example, 150 characters in 3 minutes gives 10 gross words per minute. Report accuracy separately; different typing programs may use different scoring rules.</w:t>
+      </w:r>
+    </w:p>
+    <w:p>
+      <w:bookmarkStart w:id="105" w:name="assessment"/>
+      <w:pPr>
+        <w:pStyle w:val="Heading1"/>
+        <w:pageBreakBefore/>
+      </w:pPr>
+      <w:r>
+        <w:t>Skills check and answers</w:t>
+      </w:r>
+      <w:bookmarkEnd w:id="105"/>
+    </w:p>
+    <w:p>
+      <w:pPr>
+        <w:pStyle w:val="Heading2"/>
+      </w:pPr>
+      <w:r>
+        <w:t>Practical check</w:t>
+      </w:r>
+    </w:p>
+    <w:p>
+      <w:pPr>
+        <w:numPr>
+          <w:ilvl w:val="0"/>
+          <w:numId w:val="62"/>
+        </w:numPr>
+      </w:pPr>
+      <w:r>
+        <w:t>Find F, J, Space, Enter, and Backspace without trial and error in an important document.</w:t>
+      </w:r>
+    </w:p>
+    <w:p>
+      <w:pPr>
+        <w:numPr>
+          <w:ilvl w:val="0"/>
+          <w:numId w:val="62"/>
+        </w:numPr>
+      </w:pPr>
+      <w:r>
+        <w:t>Type the message from Lesson 50. Add one sentence of your own.</w:t>
+      </w:r>
+    </w:p>
+    <w:p>
+      <w:pPr>
+        <w:numPr>
+          <w:ilvl w:val="0"/>
+          <w:numId w:val="62"/>
         </w:numPr>
       </w:pPr>
       <w:r>
@@ -5611,6 +9570,426 @@
   </w:abstractNum>
   <w:num w:numId="32">
     <w:abstractNumId w:val="31"/>
+  </w:num>
+  <w:abstractNum w:abstractNumId="32">
+    <w:lvl w:ilvl="0">
+      <w:start w:val="1"/>
+      <w:numFmt w:val="decimal"/>
+      <w:lvlText w:val="%1."/>
+      <w:lvlJc w:val="left"/>
+      <w:pPr>
+        <w:ind w:left="360" w:hanging="360"/>
+      </w:pPr>
+    </w:lvl>
+  </w:abstractNum>
+  <w:num w:numId="33">
+    <w:abstractNumId w:val="32"/>
+  </w:num>
+  <w:abstractNum w:abstractNumId="33">
+    <w:lvl w:ilvl="0">
+      <w:start w:val="1"/>
+      <w:numFmt w:val="decimal"/>
+      <w:lvlText w:val="%1."/>
+      <w:lvlJc w:val="left"/>
+      <w:pPr>
+        <w:ind w:left="360" w:hanging="360"/>
+      </w:pPr>
+    </w:lvl>
+  </w:abstractNum>
+  <w:num w:numId="34">
+    <w:abstractNumId w:val="33"/>
+  </w:num>
+  <w:abstractNum w:abstractNumId="34">
+    <w:lvl w:ilvl="0">
+      <w:start w:val="1"/>
+      <w:numFmt w:val="decimal"/>
+      <w:lvlText w:val="%1."/>
+      <w:lvlJc w:val="left"/>
+      <w:pPr>
+        <w:ind w:left="360" w:hanging="360"/>
+      </w:pPr>
+    </w:lvl>
+  </w:abstractNum>
+  <w:num w:numId="35">
+    <w:abstractNumId w:val="34"/>
+  </w:num>
+  <w:abstractNum w:abstractNumId="35">
+    <w:lvl w:ilvl="0">
+      <w:start w:val="1"/>
+      <w:numFmt w:val="decimal"/>
+      <w:lvlText w:val="%1."/>
+      <w:lvlJc w:val="left"/>
+      <w:pPr>
+        <w:ind w:left="360" w:hanging="360"/>
+      </w:pPr>
+    </w:lvl>
+  </w:abstractNum>
+  <w:num w:numId="36">
+    <w:abstractNumId w:val="35"/>
+  </w:num>
+  <w:abstractNum w:abstractNumId="36">
+    <w:lvl w:ilvl="0">
+      <w:start w:val="1"/>
+      <w:numFmt w:val="decimal"/>
+      <w:lvlText w:val="%1."/>
+      <w:lvlJc w:val="left"/>
+      <w:pPr>
+        <w:ind w:left="360" w:hanging="360"/>
+      </w:pPr>
+    </w:lvl>
+  </w:abstractNum>
+  <w:num w:numId="37">
+    <w:abstractNumId w:val="36"/>
+  </w:num>
+  <w:abstractNum w:abstractNumId="37">
+    <w:lvl w:ilvl="0">
+      <w:start w:val="1"/>
+      <w:numFmt w:val="decimal"/>
+      <w:lvlText w:val="%1."/>
+      <w:lvlJc w:val="left"/>
+      <w:pPr>
+        <w:ind w:left="360" w:hanging="360"/>
+      </w:pPr>
+    </w:lvl>
+  </w:abstractNum>
+  <w:num w:numId="38">
+    <w:abstractNumId w:val="37"/>
+  </w:num>
+  <w:abstractNum w:abstractNumId="38">
+    <w:lvl w:ilvl="0">
+      <w:start w:val="1"/>
+      <w:numFmt w:val="decimal"/>
+      <w:lvlText w:val="%1."/>
+      <w:lvlJc w:val="left"/>
+      <w:pPr>
+        <w:ind w:left="360" w:hanging="360"/>
+      </w:pPr>
+    </w:lvl>
+  </w:abstractNum>
+  <w:num w:numId="39">
+    <w:abstractNumId w:val="38"/>
+  </w:num>
+  <w:abstractNum w:abstractNumId="39">
+    <w:lvl w:ilvl="0">
+      <w:start w:val="1"/>
+      <w:numFmt w:val="decimal"/>
+      <w:lvlText w:val="%1."/>
+      <w:lvlJc w:val="left"/>
+      <w:pPr>
+        <w:ind w:left="360" w:hanging="360"/>
+      </w:pPr>
+    </w:lvl>
+  </w:abstractNum>
+  <w:num w:numId="40">
+    <w:abstractNumId w:val="39"/>
+  </w:num>
+  <w:abstractNum w:abstractNumId="40">
+    <w:lvl w:ilvl="0">
+      <w:start w:val="1"/>
+      <w:numFmt w:val="decimal"/>
+      <w:lvlText w:val="%1."/>
+      <w:lvlJc w:val="left"/>
+      <w:pPr>
+        <w:ind w:left="360" w:hanging="360"/>
+      </w:pPr>
+    </w:lvl>
+  </w:abstractNum>
+  <w:num w:numId="41">
+    <w:abstractNumId w:val="40"/>
+  </w:num>
+  <w:abstractNum w:abstractNumId="41">
+    <w:lvl w:ilvl="0">
+      <w:start w:val="1"/>
+      <w:numFmt w:val="decimal"/>
+      <w:lvlText w:val="%1."/>
+      <w:lvlJc w:val="left"/>
+      <w:pPr>
+        <w:ind w:left="360" w:hanging="360"/>
+      </w:pPr>
+    </w:lvl>
+  </w:abstractNum>
+  <w:num w:numId="42">
+    <w:abstractNumId w:val="41"/>
+  </w:num>
+  <w:abstractNum w:abstractNumId="42">
+    <w:lvl w:ilvl="0">
+      <w:start w:val="1"/>
+      <w:numFmt w:val="decimal"/>
+      <w:lvlText w:val="%1."/>
+      <w:lvlJc w:val="left"/>
+      <w:pPr>
+        <w:ind w:left="360" w:hanging="360"/>
+      </w:pPr>
+    </w:lvl>
+  </w:abstractNum>
+  <w:num w:numId="43">
+    <w:abstractNumId w:val="42"/>
+  </w:num>
+  <w:abstractNum w:abstractNumId="43">
+    <w:lvl w:ilvl="0">
+      <w:start w:val="1"/>
+      <w:numFmt w:val="decimal"/>
+      <w:lvlText w:val="%1."/>
+      <w:lvlJc w:val="left"/>
+      <w:pPr>
+        <w:ind w:left="360" w:hanging="360"/>
+      </w:pPr>
+    </w:lvl>
+  </w:abstractNum>
+  <w:num w:numId="44">
+    <w:abstractNumId w:val="43"/>
+  </w:num>
+  <w:abstractNum w:abstractNumId="44">
+    <w:lvl w:ilvl="0">
+      <w:start w:val="1"/>
+      <w:numFmt w:val="decimal"/>
+      <w:lvlText w:val="%1."/>
+      <w:lvlJc w:val="left"/>
+      <w:pPr>
+        <w:ind w:left="360" w:hanging="360"/>
+      </w:pPr>
+    </w:lvl>
+  </w:abstractNum>
+  <w:num w:numId="45">
+    <w:abstractNumId w:val="44"/>
+  </w:num>
+  <w:abstractNum w:abstractNumId="45">
+    <w:lvl w:ilvl="0">
+      <w:start w:val="1"/>
+      <w:numFmt w:val="decimal"/>
+      <w:lvlText w:val="%1."/>
+      <w:lvlJc w:val="left"/>
+      <w:pPr>
+        <w:ind w:left="360" w:hanging="360"/>
+      </w:pPr>
+    </w:lvl>
+  </w:abstractNum>
+  <w:num w:numId="46">
+    <w:abstractNumId w:val="45"/>
+  </w:num>
+  <w:abstractNum w:abstractNumId="46">
+    <w:lvl w:ilvl="0">
+      <w:start w:val="1"/>
+      <w:numFmt w:val="decimal"/>
+      <w:lvlText w:val="%1."/>
+      <w:lvlJc w:val="left"/>
+      <w:pPr>
+        <w:ind w:left="360" w:hanging="360"/>
+      </w:pPr>
+    </w:lvl>
+  </w:abstractNum>
+  <w:num w:numId="47">
+    <w:abstractNumId w:val="46"/>
+  </w:num>
+  <w:abstractNum w:abstractNumId="47">
+    <w:lvl w:ilvl="0">
+      <w:start w:val="1"/>
+      <w:numFmt w:val="decimal"/>
+      <w:lvlText w:val="%1."/>
+      <w:lvlJc w:val="left"/>
+      <w:pPr>
+        <w:ind w:left="360" w:hanging="360"/>
+      </w:pPr>
+    </w:lvl>
+  </w:abstractNum>
+  <w:num w:numId="48">
+    <w:abstractNumId w:val="47"/>
+  </w:num>
+  <w:abstractNum w:abstractNumId="48">
+    <w:lvl w:ilvl="0">
+      <w:start w:val="1"/>
+      <w:numFmt w:val="decimal"/>
+      <w:lvlText w:val="%1."/>
+      <w:lvlJc w:val="left"/>
+      <w:pPr>
+        <w:ind w:left="360" w:hanging="360"/>
+      </w:pPr>
+    </w:lvl>
+  </w:abstractNum>
+  <w:num w:numId="49">
+    <w:abstractNumId w:val="48"/>
+  </w:num>
+  <w:abstractNum w:abstractNumId="49">
+    <w:lvl w:ilvl="0">
+      <w:start w:val="1"/>
+      <w:numFmt w:val="decimal"/>
+      <w:lvlText w:val="%1."/>
+      <w:lvlJc w:val="left"/>
+      <w:pPr>
+        <w:ind w:left="360" w:hanging="360"/>
+      </w:pPr>
+    </w:lvl>
+  </w:abstractNum>
+  <w:num w:numId="50">
+    <w:abstractNumId w:val="49"/>
+  </w:num>
+  <w:abstractNum w:abstractNumId="50">
+    <w:lvl w:ilvl="0">
+      <w:start w:val="1"/>
+      <w:numFmt w:val="decimal"/>
+      <w:lvlText w:val="%1."/>
+      <w:lvlJc w:val="left"/>
+      <w:pPr>
+        <w:ind w:left="360" w:hanging="360"/>
+      </w:pPr>
+    </w:lvl>
+  </w:abstractNum>
+  <w:num w:numId="51">
+    <w:abstractNumId w:val="50"/>
+  </w:num>
+  <w:abstractNum w:abstractNumId="51">
+    <w:lvl w:ilvl="0">
+      <w:start w:val="1"/>
+      <w:numFmt w:val="decimal"/>
+      <w:lvlText w:val="%1."/>
+      <w:lvlJc w:val="left"/>
+      <w:pPr>
+        <w:ind w:left="360" w:hanging="360"/>
+      </w:pPr>
+    </w:lvl>
+  </w:abstractNum>
+  <w:num w:numId="52">
+    <w:abstractNumId w:val="51"/>
+  </w:num>
+  <w:abstractNum w:abstractNumId="52">
+    <w:lvl w:ilvl="0">
+      <w:start w:val="1"/>
+      <w:numFmt w:val="decimal"/>
+      <w:lvlText w:val="%1."/>
+      <w:lvlJc w:val="left"/>
+      <w:pPr>
+        <w:ind w:left="360" w:hanging="360"/>
+      </w:pPr>
+    </w:lvl>
+  </w:abstractNum>
+  <w:num w:numId="53">
+    <w:abstractNumId w:val="52"/>
+  </w:num>
+  <w:abstractNum w:abstractNumId="53">
+    <w:lvl w:ilvl="0">
+      <w:start w:val="1"/>
+      <w:numFmt w:val="decimal"/>
+      <w:lvlText w:val="%1."/>
+      <w:lvlJc w:val="left"/>
+      <w:pPr>
+        <w:ind w:left="360" w:hanging="360"/>
+      </w:pPr>
+    </w:lvl>
+  </w:abstractNum>
+  <w:num w:numId="54">
+    <w:abstractNumId w:val="53"/>
+  </w:num>
+  <w:abstractNum w:abstractNumId="54">
+    <w:lvl w:ilvl="0">
+      <w:start w:val="1"/>
+      <w:numFmt w:val="decimal"/>
+      <w:lvlText w:val="%1."/>
+      <w:lvlJc w:val="left"/>
+      <w:pPr>
+        <w:ind w:left="360" w:hanging="360"/>
+      </w:pPr>
+    </w:lvl>
+  </w:abstractNum>
+  <w:num w:numId="55">
+    <w:abstractNumId w:val="54"/>
+  </w:num>
+  <w:abstractNum w:abstractNumId="55">
+    <w:lvl w:ilvl="0">
+      <w:start w:val="1"/>
+      <w:numFmt w:val="decimal"/>
+      <w:lvlText w:val="%1."/>
+      <w:lvlJc w:val="left"/>
+      <w:pPr>
+        <w:ind w:left="360" w:hanging="360"/>
+      </w:pPr>
+    </w:lvl>
+  </w:abstractNum>
+  <w:num w:numId="56">
+    <w:abstractNumId w:val="55"/>
+  </w:num>
+  <w:abstractNum w:abstractNumId="56">
+    <w:lvl w:ilvl="0">
+      <w:start w:val="1"/>
+      <w:numFmt w:val="decimal"/>
+      <w:lvlText w:val="%1."/>
+      <w:lvlJc w:val="left"/>
+      <w:pPr>
+        <w:ind w:left="360" w:hanging="360"/>
+      </w:pPr>
+    </w:lvl>
+  </w:abstractNum>
+  <w:num w:numId="57">
+    <w:abstractNumId w:val="56"/>
+  </w:num>
+  <w:abstractNum w:abstractNumId="57">
+    <w:lvl w:ilvl="0">
+      <w:start w:val="1"/>
+      <w:numFmt w:val="decimal"/>
+      <w:lvlText w:val="%1."/>
+      <w:lvlJc w:val="left"/>
+      <w:pPr>
+        <w:ind w:left="360" w:hanging="360"/>
+      </w:pPr>
+    </w:lvl>
+  </w:abstractNum>
+  <w:num w:numId="58">
+    <w:abstractNumId w:val="57"/>
+  </w:num>
+  <w:abstractNum w:abstractNumId="58">
+    <w:lvl w:ilvl="0">
+      <w:start w:val="1"/>
+      <w:numFmt w:val="decimal"/>
+      <w:lvlText w:val="%1."/>
+      <w:lvlJc w:val="left"/>
+      <w:pPr>
+        <w:ind w:left="360" w:hanging="360"/>
+      </w:pPr>
+    </w:lvl>
+  </w:abstractNum>
+  <w:num w:numId="59">
+    <w:abstractNumId w:val="58"/>
+  </w:num>
+  <w:abstractNum w:abstractNumId="59">
+    <w:lvl w:ilvl="0">
+      <w:start w:val="1"/>
+      <w:numFmt w:val="decimal"/>
+      <w:lvlText w:val="%1."/>
+      <w:lvlJc w:val="left"/>
+      <w:pPr>
+        <w:ind w:left="360" w:hanging="360"/>
+      </w:pPr>
+    </w:lvl>
+  </w:abstractNum>
+  <w:num w:numId="60">
+    <w:abstractNumId w:val="59"/>
+  </w:num>
+  <w:abstractNum w:abstractNumId="60">
+    <w:lvl w:ilvl="0">
+      <w:start w:val="1"/>
+      <w:numFmt w:val="decimal"/>
+      <w:lvlText w:val="%1."/>
+      <w:lvlJc w:val="left"/>
+      <w:pPr>
+        <w:ind w:left="360" w:hanging="360"/>
+      </w:pPr>
+    </w:lvl>
+  </w:abstractNum>
+  <w:num w:numId="61">
+    <w:abstractNumId w:val="60"/>
+  </w:num>
+  <w:abstractNum w:abstractNumId="61">
+    <w:lvl w:ilvl="0">
+      <w:start w:val="1"/>
+      <w:numFmt w:val="decimal"/>
+      <w:lvlText w:val="%1."/>
+      <w:lvlJc w:val="left"/>
+      <w:pPr>
+        <w:ind w:left="360" w:hanging="360"/>
+      </w:pPr>
+    </w:lvl>
+  </w:abstractNum>
+  <w:num w:numId="62">
+    <w:abstractNumId w:val="61"/>
   </w:num>
 </w:numbering>
 </file>

</xml_diff>